<commit_message>
feat: prosync report informations updated
</commit_message>
<xml_diff>
--- a/src/assets/report/template_relatorio.docx
+++ b/src/assets/report/template_relatorio.docx
@@ -119,20 +119,40 @@
           <w:szCs w:val="32"/>
           <w:lang w:val="pt-BR"/>
         </w:rPr>
-        <w:t>{name}}</w:t>
+        <w:t>{</w:t>
+      </w:r>
+      <w:proofErr w:type="spellStart"/>
+      <w:r>
+        <w:rPr>
+          <w:rFonts w:ascii="Calibri" w:eastAsia="Calibri" w:hAnsi="Calibri" w:cs="Calibri"/>
+          <w:b/>
+          <w:bCs/>
+          <w:sz w:val="32"/>
+          <w:szCs w:val="32"/>
+          <w:lang w:val="pt-BR"/>
+        </w:rPr>
+        <w:t>name</w:t>
+      </w:r>
+      <w:proofErr w:type="spellEnd"/>
+      <w:r>
+        <w:rPr>
+          <w:rFonts w:ascii="Calibri" w:eastAsia="Calibri" w:hAnsi="Calibri" w:cs="Calibri"/>
+          <w:b/>
+          <w:bCs/>
+          <w:sz w:val="32"/>
+          <w:szCs w:val="32"/>
+          <w:lang w:val="pt-BR"/>
+        </w:rPr>
+        <w:t>}}</w:t>
       </w:r>
     </w:p>
     <w:p>
       <w:pPr>
-        <w:pStyle w:val="PargrafodaLista"/>
-        <w:numPr>
-          <w:ilvl w:val="0"/>
-          <w:numId w:val="2"/>
-        </w:numPr>
         <w:rPr>
           <w:rFonts w:ascii="Calibri" w:eastAsia="Calibri" w:hAnsi="Calibri" w:cs="Calibri"/>
           <w:b/>
           <w:bCs/>
+          <w:lang w:val="pt-BR"/>
         </w:rPr>
       </w:pPr>
       <w:bookmarkStart w:id="0" w:name="_heading=h.1c1ocwgpu34w" w:colFirst="0" w:colLast="0"/>
@@ -142,8 +162,18 @@
           <w:rFonts w:ascii="Calibri" w:eastAsia="Calibri" w:hAnsi="Calibri" w:cs="Calibri"/>
           <w:b/>
           <w:bCs/>
+          <w:lang w:val="pt-BR"/>
         </w:rPr>
-        <w:t>ANÁLISE BIOENERGÉTICA</w:t>
+        <w:t>1.</w:t>
+      </w:r>
+      <w:r>
+        <w:rPr>
+          <w:rFonts w:ascii="Calibri" w:eastAsia="Calibri" w:hAnsi="Calibri" w:cs="Calibri"/>
+          <w:b/>
+          <w:bCs/>
+          <w:lang w:val="pt-BR"/>
+        </w:rPr>
+        <w:t xml:space="preserve"> ANÁLISE BIOENERGÉTICA E BIORRESSONÂNCIA</w:t>
       </w:r>
     </w:p>
     <w:p>
@@ -158,29 +188,50 @@
           <w:rFonts w:ascii="Calibri" w:eastAsia="Calibri" w:hAnsi="Calibri" w:cs="Calibri"/>
           <w:lang w:val="pt-BR"/>
         </w:rPr>
-        <w:t>A análise de biorressonância realizada por sistemas como Prosync, Oberon ou Meta Hunter, não substitui o diagnóstico clínico.  Tem como propósito identificar padrões de frequência emitidos pelos tecidos e órgãos do corpo. Cada célula, estrutura ou microrganismo vibra dentro de uma faixa específica, e esses sistemas comparam essas assinaturas com bancos de dados de laboratórios que realizam medições biofísicas</w:t>
+        <w:t xml:space="preserve">A análise de </w:t>
       </w:r>
-      <w:r>
-        <w:rPr>
-          <w:rFonts w:ascii="Calibri" w:eastAsia="Calibri" w:hAnsi="Calibri" w:cs="Calibri"/>
-          <w:b/>
-          <w:bCs/>
-          <w:lang w:val="pt-BR"/>
-        </w:rPr>
-        <w:t xml:space="preserve">  ut</w:t>
-      </w:r>
+      <w:proofErr w:type="spellStart"/>
       <w:r>
         <w:rPr>
           <w:rFonts w:ascii="Calibri" w:eastAsia="Calibri" w:hAnsi="Calibri" w:cs="Calibri"/>
           <w:lang w:val="pt-BR"/>
         </w:rPr>
-        <w:t>ilizando equipamentos de espectroscopia e detecção eletromagnética.</w:t>
+        <w:t>biorressonância</w:t>
+      </w:r>
+      <w:proofErr w:type="spellEnd"/>
+      <w:r>
+        <w:rPr>
+          <w:rFonts w:ascii="Calibri" w:eastAsia="Calibri" w:hAnsi="Calibri" w:cs="Calibri"/>
+          <w:lang w:val="pt-BR"/>
+        </w:rPr>
+        <w:t xml:space="preserve"> (por sistemas como </w:t>
+      </w:r>
+      <w:proofErr w:type="spellStart"/>
+      <w:r>
+        <w:rPr>
+          <w:rFonts w:ascii="Calibri" w:eastAsia="Calibri" w:hAnsi="Calibri" w:cs="Calibri"/>
+          <w:lang w:val="pt-BR"/>
+        </w:rPr>
+        <w:t>Prosync</w:t>
+      </w:r>
+      <w:proofErr w:type="spellEnd"/>
+      <w:r>
+        <w:rPr>
+          <w:rFonts w:ascii="Calibri" w:eastAsia="Calibri" w:hAnsi="Calibri" w:cs="Calibri"/>
+          <w:lang w:val="pt-BR"/>
+        </w:rPr>
+        <w:t>, Oberon ou Meta Hunter) não substitui o diagnóstico clínico. Seu propósito é identificar e medir padrões de frequência vibracional emitidos por tecidos e órgãos do corpo, comparando-os com assinaturas de frequência consideradas ideais.</w:t>
       </w:r>
     </w:p>
     <w:p>
       <w:pPr>
+        <w:numPr>
+          <w:ilvl w:val="0"/>
+          <w:numId w:val="4"/>
+        </w:numPr>
         <w:rPr>
           <w:rFonts w:ascii="Calibri" w:eastAsia="Calibri" w:hAnsi="Calibri" w:cs="Calibri"/>
+          <w:lang w:val="pt-BR"/>
         </w:rPr>
       </w:pPr>
       <w:r>
@@ -188,104 +239,46 @@
           <w:rFonts w:ascii="Calibri" w:eastAsia="Calibri" w:hAnsi="Calibri" w:cs="Calibri"/>
           <w:lang w:val="pt-BR"/>
         </w:rPr>
-        <w:t xml:space="preserve">Quando há incongruência entre a frequência ideal e a frequência detectada, o software registra um “desvio” — frequentemente interpretado como resposta inflamatória, estresse celular ou presença de agentes biológicos.  </w:t>
+        <w:t xml:space="preserve">Princípio Básico: Cada célula, estrutura e microrganismo vibra dentro de uma faixa de frequência específica. O sistema de </w:t>
       </w:r>
+      <w:proofErr w:type="spellStart"/>
       <w:r>
         <w:rPr>
           <w:rFonts w:ascii="Calibri" w:eastAsia="Calibri" w:hAnsi="Calibri" w:cs="Calibri"/>
+          <w:lang w:val="pt-BR"/>
         </w:rPr>
-        <w:t>Assim, este relatório tem como objetivos:</w:t>
+        <w:t>biorressonância</w:t>
+      </w:r>
+      <w:proofErr w:type="spellEnd"/>
+      <w:r>
+        <w:rPr>
+          <w:rFonts w:ascii="Calibri" w:eastAsia="Calibri" w:hAnsi="Calibri" w:cs="Calibri"/>
+          <w:lang w:val="pt-BR"/>
+        </w:rPr>
+        <w:t xml:space="preserve"> compara a frequência medida no paciente com faixas de referência estabelecidas por pesquisa biofísica.</w:t>
       </w:r>
     </w:p>
     <w:p>
       <w:pPr>
         <w:numPr>
           <w:ilvl w:val="0"/>
-          <w:numId w:val="1"/>
+          <w:numId w:val="4"/>
         </w:numPr>
-        <w:pBdr>
-          <w:top w:val="nil"/>
-          <w:left w:val="nil"/>
-          <w:bottom w:val="nil"/>
-          <w:right w:val="nil"/>
-          <w:between w:val="nil"/>
-        </w:pBdr>
-        <w:spacing w:after="0"/>
         <w:rPr>
           <w:rFonts w:ascii="Calibri" w:eastAsia="Calibri" w:hAnsi="Calibri" w:cs="Calibri"/>
-          <w:color w:val="000000"/>
           <w:lang w:val="pt-BR"/>
         </w:rPr>
       </w:pPr>
       <w:r>
         <w:rPr>
           <w:rFonts w:ascii="Calibri" w:eastAsia="Calibri" w:hAnsi="Calibri" w:cs="Calibri"/>
-          <w:color w:val="000000"/>
           <w:lang w:val="pt-BR"/>
         </w:rPr>
-        <w:t>Esclarecer os elementos que mostram ressonância no seu corpo;</w:t>
+        <w:t>Detecção de Desvios: A incongruência entre a frequência ideal e a frequência detectada é registrada como um "desvio". Esse desvio é frequentemente interpretado como um indicativo de estresse celular, resposta inflamatória e/ou presença de agentes biológicos.</w:t>
       </w:r>
     </w:p>
     <w:p>
       <w:pPr>
-        <w:numPr>
-          <w:ilvl w:val="0"/>
-          <w:numId w:val="1"/>
-        </w:numPr>
-        <w:pBdr>
-          <w:top w:val="nil"/>
-          <w:left w:val="nil"/>
-          <w:bottom w:val="nil"/>
-          <w:right w:val="nil"/>
-          <w:between w:val="nil"/>
-        </w:pBdr>
-        <w:spacing w:after="0"/>
-        <w:rPr>
-          <w:rFonts w:ascii="Calibri" w:eastAsia="Calibri" w:hAnsi="Calibri" w:cs="Calibri"/>
-          <w:color w:val="000000"/>
-          <w:lang w:val="pt-BR"/>
-        </w:rPr>
-      </w:pPr>
-      <w:r>
-        <w:rPr>
-          <w:rFonts w:ascii="Calibri" w:eastAsia="Calibri" w:hAnsi="Calibri" w:cs="Calibri"/>
-          <w:color w:val="000000"/>
-          <w:lang w:val="pt-BR"/>
-        </w:rPr>
-        <w:t>Apresentar os possíveis efeitos associados;</w:t>
-      </w:r>
-    </w:p>
-    <w:p>
-      <w:pPr>
-        <w:numPr>
-          <w:ilvl w:val="0"/>
-          <w:numId w:val="1"/>
-        </w:numPr>
-        <w:pBdr>
-          <w:top w:val="nil"/>
-          <w:left w:val="nil"/>
-          <w:bottom w:val="nil"/>
-          <w:right w:val="nil"/>
-          <w:between w:val="nil"/>
-        </w:pBdr>
-        <w:rPr>
-          <w:rFonts w:ascii="Calibri" w:eastAsia="Calibri" w:hAnsi="Calibri" w:cs="Calibri"/>
-          <w:color w:val="000000"/>
-          <w:lang w:val="pt-BR"/>
-        </w:rPr>
-      </w:pPr>
-      <w:r>
-        <w:rPr>
-          <w:rFonts w:ascii="Calibri" w:eastAsia="Calibri" w:hAnsi="Calibri" w:cs="Calibri"/>
-          <w:color w:val="000000"/>
-          <w:lang w:val="pt-BR"/>
-        </w:rPr>
-        <w:t>Orientar um caminho terapêutico seguro e personalizado.</w:t>
-      </w:r>
-    </w:p>
-    <w:p>
-      <w:pPr>
-        <w:spacing w:after="120" w:line="240" w:lineRule="auto"/>
         <w:rPr>
           <w:rFonts w:ascii="Calibri" w:eastAsia="Calibri" w:hAnsi="Calibri" w:cs="Calibri"/>
           <w:b/>
@@ -300,12 +293,65 @@
           <w:bCs/>
           <w:lang w:val="pt-BR"/>
         </w:rPr>
-        <w:t>2. CATEGORIAS DA ANÁLISE</w:t>
+        <w:t xml:space="preserve">2. </w:t>
+      </w:r>
+      <w:r>
+        <w:rPr>
+          <w:rFonts w:ascii="Calibri" w:eastAsia="Calibri" w:hAnsi="Calibri" w:cs="Calibri"/>
+          <w:b/>
+          <w:bCs/>
+          <w:lang w:val="pt-BR"/>
+        </w:rPr>
+        <w:t>CATEGORIAS DA ANÁLISE</w:t>
       </w:r>
     </w:p>
     <w:p>
       <w:pPr>
-        <w:spacing w:after="120" w:line="240" w:lineRule="auto"/>
+        <w:rPr>
+          <w:rFonts w:ascii="Calibri" w:eastAsia="Calibri" w:hAnsi="Calibri" w:cs="Calibri"/>
+          <w:lang w:val="pt-BR"/>
+        </w:rPr>
+      </w:pPr>
+      <w:r>
+        <w:rPr>
+          <w:rFonts w:ascii="Calibri" w:eastAsia="Calibri" w:hAnsi="Calibri" w:cs="Calibri"/>
+          <w:lang w:val="pt-BR"/>
+        </w:rPr>
+        <w:t xml:space="preserve">A análise de </w:t>
+      </w:r>
+      <w:proofErr w:type="spellStart"/>
+      <w:r>
+        <w:rPr>
+          <w:rFonts w:ascii="Calibri" w:eastAsia="Calibri" w:hAnsi="Calibri" w:cs="Calibri"/>
+          <w:lang w:val="pt-BR"/>
+        </w:rPr>
+        <w:t>biorress</w:t>
+      </w:r>
+      <w:r>
+        <w:rPr>
+          <w:rFonts w:ascii="Calibri" w:eastAsia="Calibri" w:hAnsi="Calibri" w:cs="Calibri"/>
+          <w:lang w:val="pt-BR"/>
+        </w:rPr>
+        <w:t>onâ</w:t>
+      </w:r>
+      <w:r>
+        <w:rPr>
+          <w:rFonts w:ascii="Calibri" w:eastAsia="Calibri" w:hAnsi="Calibri" w:cs="Calibri"/>
+          <w:lang w:val="pt-BR"/>
+        </w:rPr>
+        <w:t>ncia</w:t>
+      </w:r>
+      <w:proofErr w:type="spellEnd"/>
+      <w:r>
+        <w:rPr>
+          <w:rFonts w:ascii="Calibri" w:eastAsia="Calibri" w:hAnsi="Calibri" w:cs="Calibri"/>
+          <w:lang w:val="pt-BR"/>
+        </w:rPr>
+        <w:t xml:space="preserve"> pode ser categorizada em diferentes seções para avaliar o impacto dos fatores que interferem no equilíbrio orgânico e energético do indivíduo.</w:t>
+      </w:r>
+    </w:p>
+    <w:p>
+      <w:pPr>
         <w:rPr>
           <w:rFonts w:ascii="Calibri" w:eastAsia="Calibri" w:hAnsi="Calibri" w:cs="Calibri"/>
           <w:b/>
@@ -320,12 +366,14 @@
           <w:bCs/>
           <w:lang w:val="pt-BR"/>
         </w:rPr>
-        <w:t>2.1.  Microrganismos</w:t>
+        <w:t>2.1. Microrganismos</w:t>
       </w:r>
     </w:p>
     <w:p>
       <w:pPr>
-        <w:spacing w:after="120" w:line="240" w:lineRule="auto"/>
+        <w:tabs>
+          <w:tab w:val="num" w:pos="720"/>
+        </w:tabs>
         <w:rPr>
           <w:rFonts w:ascii="Calibri" w:eastAsia="Calibri" w:hAnsi="Calibri" w:cs="Calibri"/>
           <w:lang w:val="pt-BR"/>
@@ -336,12 +384,11 @@
           <w:rFonts w:ascii="Calibri" w:eastAsia="Calibri" w:hAnsi="Calibri" w:cs="Calibri"/>
           <w:lang w:val="pt-BR"/>
         </w:rPr>
-        <w:t>Esta categoria  de análise identifica microrganismos que apresentam ressonância com o campo biológico do pacientes. Os sintomas associados refletem descrições clínicas reconhecidas para esses agentes, mas variam conforme as particularidades fisiológicas e energéticas de cada indivíduo.</w:t>
+        <w:t>Esta categoria identifica microrganismos que apresentam ressonância com o campo biológico do paciente. Os sintomas associados refletem descrições clínicas reconhecidas, mas a manifestação varia conforme as particularidades fisiológicas e energéticas individuais.</w:t>
       </w:r>
     </w:p>
     <w:p>
       <w:pPr>
-        <w:spacing w:after="120" w:line="240" w:lineRule="auto"/>
         <w:rPr>
           <w:rFonts w:ascii="Calibri" w:eastAsia="Calibri" w:hAnsi="Calibri" w:cs="Calibri"/>
           <w:lang w:val="pt-BR"/>
@@ -352,12 +399,11 @@
           <w:rFonts w:ascii="Calibri" w:eastAsia="Calibri" w:hAnsi="Calibri" w:cs="Calibri"/>
           <w:lang w:val="pt-BR"/>
         </w:rPr>
-        <w:t>Na abordagem integrativa, autores como a Dra. Hulda Clark sugerem que alterações do bem-estar podem resultar da combinação entre um microrganismo e uma toxina associada, reforçando a ideia de que fatores biológicos, ambientais e energéticos podem influenciar o equilíbrio orgânico. Essa perspectiva não substitui diagnósticos médicos, mas amplia o entendimento das interações que podem contribuir para desequilíbrios sistêmicos.</w:t>
+        <w:t>Na abordagem integrativa, desequilíbrios de bem-estar podem resultar da combinação sinérgica de um microrganismo com uma toxina associada.</w:t>
       </w:r>
     </w:p>
     <w:p>
       <w:pPr>
-        <w:spacing w:after="120" w:line="240" w:lineRule="auto"/>
         <w:rPr>
           <w:rFonts w:ascii="Calibri" w:eastAsia="Calibri" w:hAnsi="Calibri" w:cs="Calibri"/>
           <w:b/>
@@ -377,7 +423,9 @@
     </w:p>
     <w:p>
       <w:pPr>
-        <w:spacing w:after="120" w:line="240" w:lineRule="auto"/>
+        <w:tabs>
+          <w:tab w:val="num" w:pos="720"/>
+        </w:tabs>
         <w:rPr>
           <w:rFonts w:ascii="Calibri" w:eastAsia="Calibri" w:hAnsi="Calibri" w:cs="Calibri"/>
           <w:lang w:val="pt-BR"/>
@@ -388,12 +436,37 @@
           <w:rFonts w:ascii="Calibri" w:eastAsia="Calibri" w:hAnsi="Calibri" w:cs="Calibri"/>
           <w:lang w:val="pt-BR"/>
         </w:rPr>
-        <w:t>Esta categoria  identifica no indivíduo substâncias capazes de interferir de maneira significativa na regulação fisiológica e bioenergética do organismo, incluindo metais pesados, solventes, agrotóxicos, xenoestrógenos, radiação, além de toxinas ambientais, alimentares, intestinais, nervosas e de fármacos.</w:t>
+        <w:t xml:space="preserve">Esta análise inclui metais pesados, solventes, agrotóxicos, </w:t>
+      </w:r>
+      <w:proofErr w:type="spellStart"/>
+      <w:r>
+        <w:rPr>
+          <w:rFonts w:ascii="Calibri" w:eastAsia="Calibri" w:hAnsi="Calibri" w:cs="Calibri"/>
+          <w:lang w:val="pt-BR"/>
+        </w:rPr>
+        <w:t>xenoestrógenos</w:t>
+      </w:r>
+      <w:proofErr w:type="spellEnd"/>
+      <w:r>
+        <w:rPr>
+          <w:rFonts w:ascii="Calibri" w:eastAsia="Calibri" w:hAnsi="Calibri" w:cs="Calibri"/>
+          <w:lang w:val="pt-BR"/>
+        </w:rPr>
+        <w:t>, radiação e toxinas diversas (ambientais, alimentares, intestinais, nervosas e farmacológicas).</w:t>
+      </w:r>
+      <w:r>
+        <w:rPr>
+          <w:rFonts w:ascii="Calibri" w:eastAsia="Calibri" w:hAnsi="Calibri" w:cs="Calibri"/>
+          <w:lang w:val="pt-BR"/>
+        </w:rPr>
+        <w:t xml:space="preserve"> </w:t>
       </w:r>
     </w:p>
     <w:p>
       <w:pPr>
-        <w:spacing w:after="120" w:line="240" w:lineRule="auto"/>
+        <w:tabs>
+          <w:tab w:val="num" w:pos="720"/>
+        </w:tabs>
         <w:rPr>
           <w:rFonts w:ascii="Calibri" w:eastAsia="Calibri" w:hAnsi="Calibri" w:cs="Calibri"/>
           <w:lang w:val="pt-BR"/>
@@ -404,12 +477,11 @@
           <w:rFonts w:ascii="Calibri" w:eastAsia="Calibri" w:hAnsi="Calibri" w:cs="Calibri"/>
           <w:lang w:val="pt-BR"/>
         </w:rPr>
-        <w:t>Apesar de suas diferenças, todas têm potencial para sobrecarregar os sistemas de detoxificação, aumentar o estresse oxidativo e desestabilizar o metabolismo. Evidências também indicam que a presença de toxinas pode reduzir a eficiência imunológica, alterar o pH dos tecidos, favorecer disbiose e criar condições que facilitam a proliferação de microrganismos oportunistas.</w:t>
+        <w:t>Tais substâncias contribuem para o aumento do estresse oxidativo, desestabilização metabólica e redução da eficiência imunológica, bem como alteram o pH dos tecidos e favorecem a disbiose, facilitando a proliferação de microrganismos oportunistas.</w:t>
       </w:r>
     </w:p>
     <w:p>
       <w:pPr>
-        <w:spacing w:after="120" w:line="240" w:lineRule="auto"/>
         <w:rPr>
           <w:rFonts w:ascii="Calibri" w:eastAsia="Calibri" w:hAnsi="Calibri" w:cs="Calibri"/>
           <w:b/>
@@ -424,12 +496,22 @@
           <w:bCs/>
           <w:lang w:val="pt-BR"/>
         </w:rPr>
-        <w:t>2.3. Campo morfogenético</w:t>
+        <w:t xml:space="preserve">2.3. Campo </w:t>
       </w:r>
+      <w:proofErr w:type="spellStart"/>
+      <w:r>
+        <w:rPr>
+          <w:rFonts w:ascii="Calibri" w:eastAsia="Calibri" w:hAnsi="Calibri" w:cs="Calibri"/>
+          <w:b/>
+          <w:bCs/>
+          <w:lang w:val="pt-BR"/>
+        </w:rPr>
+        <w:t>Morfogenético</w:t>
+      </w:r>
+      <w:proofErr w:type="spellEnd"/>
     </w:p>
     <w:p>
       <w:pPr>
-        <w:spacing w:after="120" w:line="240" w:lineRule="auto"/>
         <w:rPr>
           <w:rFonts w:ascii="Calibri" w:eastAsia="Calibri" w:hAnsi="Calibri" w:cs="Calibri"/>
           <w:lang w:val="pt-BR"/>
@@ -440,33 +522,81 @@
           <w:rFonts w:ascii="Calibri" w:eastAsia="Calibri" w:hAnsi="Calibri" w:cs="Calibri"/>
           <w:lang w:val="pt-BR"/>
         </w:rPr>
-        <w:t xml:space="preserve">A análise do campo morfogenético também é </w:t>
+        <w:t xml:space="preserve">O campo </w:t>
+      </w:r>
+      <w:proofErr w:type="spellStart"/>
+      <w:r>
+        <w:rPr>
+          <w:rFonts w:ascii="Calibri" w:eastAsia="Calibri" w:hAnsi="Calibri" w:cs="Calibri"/>
+          <w:lang w:val="pt-BR"/>
+        </w:rPr>
+        <w:t>morfogenético</w:t>
+      </w:r>
+      <w:proofErr w:type="spellEnd"/>
+      <w:r>
+        <w:rPr>
+          <w:rFonts w:ascii="Calibri" w:eastAsia="Calibri" w:hAnsi="Calibri" w:cs="Calibri"/>
+          <w:lang w:val="pt-BR"/>
+        </w:rPr>
+        <w:t xml:space="preserve"> é captado via </w:t>
+      </w:r>
+      <w:proofErr w:type="spellStart"/>
+      <w:r>
+        <w:rPr>
+          <w:rFonts w:ascii="Calibri" w:eastAsia="Calibri" w:hAnsi="Calibri" w:cs="Calibri"/>
+          <w:lang w:val="pt-BR"/>
+        </w:rPr>
+        <w:t>biorressonância</w:t>
+      </w:r>
+      <w:proofErr w:type="spellEnd"/>
+      <w:r>
+        <w:rPr>
+          <w:rFonts w:ascii="Calibri" w:eastAsia="Calibri" w:hAnsi="Calibri" w:cs="Calibri"/>
+          <w:lang w:val="pt-BR"/>
+        </w:rPr>
+        <w:t xml:space="preserve"> para identificar o impacto de fatores psicoemocionais e </w:t>
+      </w:r>
+      <w:proofErr w:type="gramStart"/>
+      <w:r>
+        <w:rPr>
+          <w:rFonts w:ascii="Calibri" w:eastAsia="Calibri" w:hAnsi="Calibri" w:cs="Calibri"/>
+          <w:lang w:val="pt-BR"/>
+        </w:rPr>
+        <w:t>sociais</w:t>
       </w:r>
       <w:r>
         <w:rPr>
           <w:rFonts w:ascii="Calibri" w:eastAsia="Calibri" w:hAnsi="Calibri" w:cs="Calibri"/>
           <w:lang w:val="pt-BR"/>
         </w:rPr>
-        <w:pgNum/>
+        <w:t xml:space="preserve">  no</w:t>
       </w:r>
+      <w:proofErr w:type="gramEnd"/>
       <w:r>
         <w:rPr>
           <w:rFonts w:ascii="Calibri" w:eastAsia="Calibri" w:hAnsi="Calibri" w:cs="Calibri"/>
           <w:lang w:val="pt-BR"/>
         </w:rPr>
-        <w:t>ossível</w:t>
+        <w:t xml:space="preserve"> organismo. </w:t>
       </w:r>
+    </w:p>
+    <w:p>
+      <w:pPr>
+        <w:rPr>
+          <w:rFonts w:ascii="Calibri" w:eastAsia="Calibri" w:hAnsi="Calibri" w:cs="Calibri"/>
+          <w:lang w:val="pt-BR"/>
+        </w:rPr>
+      </w:pPr>
       <w:r>
         <w:rPr>
           <w:rFonts w:ascii="Calibri" w:eastAsia="Calibri" w:hAnsi="Calibri" w:cs="Calibri"/>
           <w:lang w:val="pt-BR"/>
         </w:rPr>
-        <w:t xml:space="preserve"> de ser realizado por meio da biorressonância, Pesquisas demonstram que o estresse crônico, as emoções persistentes e os conflitos psicossociais provocam alterações mensuráveis na atividade elétrica cerebral, na coerência cardíaca, na função imunológica e na regulação neuroendócrina. Esses mecanismos são compatíveis com a concepção de um campo regulatório que integra corpo, ambiente e experiência emocional onde fatores psicológicos influenciam diretamente a fisiologia e que desequilíbrios orgânicos também repercutam no campo emocional.</w:t>
+        <w:t>Pesquisas demonstram que estresse crônico, emoções persistentes e conflitos psicossociais induzem alterações mensuráveis na atividade elétrica cerebral, coerência cardíaca, função imunológica e regulação neuroendócrina.</w:t>
       </w:r>
     </w:p>
     <w:p>
       <w:pPr>
-        <w:spacing w:after="120" w:line="240" w:lineRule="auto"/>
         <w:rPr>
           <w:rFonts w:ascii="Calibri" w:eastAsia="Calibri" w:hAnsi="Calibri" w:cs="Calibri"/>
           <w:b/>
@@ -487,7 +617,6 @@
     </w:p>
     <w:p>
       <w:pPr>
-        <w:spacing w:after="120" w:line="240" w:lineRule="auto"/>
         <w:rPr>
           <w:rFonts w:ascii="Calibri" w:eastAsia="Calibri" w:hAnsi="Calibri" w:cs="Calibri"/>
           <w:lang w:val="pt-BR"/>
@@ -498,12 +627,14 @@
           <w:rFonts w:ascii="Calibri" w:eastAsia="Calibri" w:hAnsi="Calibri" w:cs="Calibri"/>
           <w:lang w:val="pt-BR"/>
         </w:rPr>
-        <w:t xml:space="preserve">Essa categoria de análise  não substitui orientações nutricionais convencionais, mas indica como determinados alimentos podem influenciar o equilíbrio energético, digestório, inflamatório e imunológico do indivíduo. </w:t>
+        <w:t>Esta análise não substitui as orientações nutricionais convencionais, mas indica como alimentos específicos podem influenciar o equilíbrio energético, digestório, inflamatório e imunológico.</w:t>
       </w:r>
     </w:p>
     <w:p>
       <w:pPr>
-        <w:spacing w:after="120" w:line="240" w:lineRule="auto"/>
+        <w:tabs>
+          <w:tab w:val="num" w:pos="720"/>
+        </w:tabs>
         <w:rPr>
           <w:rFonts w:ascii="Calibri" w:eastAsia="Calibri" w:hAnsi="Calibri" w:cs="Calibri"/>
           <w:lang w:val="pt-BR"/>
@@ -514,7 +645,59 @@
           <w:rFonts w:ascii="Calibri" w:eastAsia="Calibri" w:hAnsi="Calibri" w:cs="Calibri"/>
           <w:lang w:val="pt-BR"/>
         </w:rPr>
-        <w:t>A compatibilidade alimentar é definida por padrões de ressonância entre o organismo e cada alimento testado. Esses padrões refletem a resposta adaptativa do corpo, sugerindo se determinado item contribui para a harmonia fisiológica ou, ao contrário, aumenta o estresse metabólico.</w:t>
+        <w:t>A compatibilidade alimentar é determinada pela ressonância entre o organismo e cada alimento testado. Os padrões de ressonância sugerem se o alimento contribui para a harmonia fisiológica ou, inversamente, aumenta o estresse metabólico.</w:t>
+      </w:r>
+    </w:p>
+    <w:p>
+      <w:pPr>
+        <w:rPr>
+          <w:rFonts w:ascii="Calibri" w:eastAsia="Calibri" w:hAnsi="Calibri" w:cs="Calibri"/>
+          <w:b/>
+          <w:bCs/>
+          <w:lang w:val="pt-BR"/>
+        </w:rPr>
+      </w:pPr>
+      <w:r>
+        <w:rPr>
+          <w:rFonts w:ascii="Calibri" w:eastAsia="Calibri" w:hAnsi="Calibri" w:cs="Calibri"/>
+          <w:b/>
+          <w:bCs/>
+          <w:lang w:val="pt-BR"/>
+        </w:rPr>
+        <w:t>2.5. Pedras e Cristais</w:t>
+      </w:r>
+    </w:p>
+    <w:p>
+      <w:pPr>
+        <w:rPr>
+          <w:rFonts w:ascii="Calibri" w:eastAsia="Calibri" w:hAnsi="Calibri" w:cs="Calibri"/>
+          <w:lang w:val="pt-BR"/>
+        </w:rPr>
+      </w:pPr>
+      <w:r>
+        <w:rPr>
+          <w:rFonts w:ascii="Calibri" w:eastAsia="Calibri" w:hAnsi="Calibri" w:cs="Calibri"/>
+          <w:lang w:val="pt-BR"/>
+        </w:rPr>
+        <w:t>Pedras e cristais possuem uma organização atômica altamente estável, emitindo padrões vibracionais constantes (referências de coerência).</w:t>
+      </w:r>
+    </w:p>
+    <w:p>
+      <w:pPr>
+        <w:tabs>
+          <w:tab w:val="num" w:pos="720"/>
+        </w:tabs>
+        <w:rPr>
+          <w:rFonts w:ascii="Calibri" w:eastAsia="Calibri" w:hAnsi="Calibri" w:cs="Calibri"/>
+          <w:lang w:val="pt-BR"/>
+        </w:rPr>
+      </w:pPr>
+      <w:r>
+        <w:rPr>
+          <w:rFonts w:ascii="Calibri" w:eastAsia="Calibri" w:hAnsi="Calibri" w:cs="Calibri"/>
+          <w:lang w:val="pt-BR"/>
+        </w:rPr>
+        <w:t>Esses padrões podem interagir com sistemas biológicos e emocionais em desregulação. Sendo assim, a afinidade com determinados cristais sugere que o organismo está buscando restaurar sua própria estabilidade, e esses elementos podem atuar como suportes externos para favorecer esse processo contribuindo para a redução do estresse, estabilização emocional, regulação do sistema nervoso autônomo e aumento da vitalidade.</w:t>
       </w:r>
     </w:p>
     <w:p>
@@ -534,62 +717,9 @@
           <w:bCs/>
           <w:lang w:val="pt-BR"/>
         </w:rPr>
-        <w:t>2.5. Pedras e cristais</w:t>
+        <w:t xml:space="preserve">3. INTERPRETAÇÃO </w:t>
       </w:r>
-    </w:p>
-    <w:p>
-      <w:pPr>
-        <w:spacing w:after="120" w:line="240" w:lineRule="auto"/>
-        <w:rPr>
-          <w:rFonts w:ascii="Calibri" w:eastAsia="Calibri" w:hAnsi="Calibri" w:cs="Calibri"/>
-          <w:lang w:val="pt-BR"/>
-        </w:rPr>
-      </w:pPr>
-      <w:r>
-        <w:rPr>
-          <w:rFonts w:ascii="Calibri" w:eastAsia="Calibri" w:hAnsi="Calibri" w:cs="Calibri"/>
-          <w:lang w:val="pt-BR"/>
-        </w:rPr>
-        <w:t>Cada pedra ou cristal apresenta uma organização atômica altamente estável, capaz de emitir padrões vibracionais constantes. Esses padrões funcionam como referências de coerência que podem interagir com sistemas biológicos e emocionais que se encontram em desregulação. Quando a análise de biorressonância indica afinidade com determinados cristais, isso sugere que o organismo está buscando restaurar sua própria estabilidade e que esses elementos podem atuar como suportes externos para favorecer esse processo.</w:t>
-      </w:r>
-    </w:p>
-    <w:p>
-      <w:pPr>
-        <w:spacing w:after="120" w:line="240" w:lineRule="auto"/>
-        <w:rPr>
-          <w:rFonts w:ascii="Calibri" w:eastAsia="Calibri" w:hAnsi="Calibri" w:cs="Calibri"/>
-          <w:lang w:val="pt-BR"/>
-        </w:rPr>
-      </w:pPr>
-      <w:r>
-        <w:rPr>
-          <w:rFonts w:ascii="Calibri" w:eastAsia="Calibri" w:hAnsi="Calibri" w:cs="Calibri"/>
-          <w:lang w:val="pt-BR"/>
-        </w:rPr>
-        <w:t xml:space="preserve">Nesse contexto, embora seus efeitos pareçam sutis, o uso de cristais pode contribuir para redução de estresse, maior clareza mental, estabilização emocional, regulação do sistema nervoso autônomo, melhora do sono, sensação de enraizamento e aumento da vitalidade. </w:t>
-      </w:r>
-    </w:p>
-    <w:p>
-      <w:pPr>
-        <w:spacing w:after="120" w:line="240" w:lineRule="auto"/>
-        <w:rPr>
-          <w:rFonts w:ascii="Calibri" w:eastAsia="Calibri" w:hAnsi="Calibri" w:cs="Calibri"/>
-          <w:b/>
-          <w:bCs/>
-          <w:lang w:val="pt-BR"/>
-        </w:rPr>
-      </w:pPr>
-    </w:p>
-    <w:p>
-      <w:pPr>
-        <w:spacing w:after="120" w:line="240" w:lineRule="auto"/>
-        <w:rPr>
-          <w:rFonts w:ascii="Calibri" w:eastAsia="Calibri" w:hAnsi="Calibri" w:cs="Calibri"/>
-          <w:b/>
-          <w:bCs/>
-          <w:lang w:val="pt-BR"/>
-        </w:rPr>
-      </w:pPr>
+      <w:proofErr w:type="gramStart"/>
       <w:r>
         <w:rPr>
           <w:rFonts w:ascii="Calibri" w:eastAsia="Calibri" w:hAnsi="Calibri" w:cs="Calibri"/>
@@ -597,7 +727,17 @@
           <w:bCs/>
           <w:lang w:val="pt-BR"/>
         </w:rPr>
-        <w:t>3. INTERPRETAÇÃO DOS  RESULTADOS DAS ANÁLISES</w:t>
+        <w:t>DOS  RESULTADOS</w:t>
+      </w:r>
+      <w:proofErr w:type="gramEnd"/>
+      <w:r>
+        <w:rPr>
+          <w:rFonts w:ascii="Calibri" w:eastAsia="Calibri" w:hAnsi="Calibri" w:cs="Calibri"/>
+          <w:b/>
+          <w:bCs/>
+          <w:lang w:val="pt-BR"/>
+        </w:rPr>
+        <w:t xml:space="preserve"> DAS ANÁLISES</w:t>
       </w:r>
     </w:p>
     <w:p>
@@ -608,13 +748,23 @@
           <w:lang w:val="pt-BR"/>
         </w:rPr>
       </w:pPr>
+      <w:proofErr w:type="gramStart"/>
       <w:r>
         <w:rPr>
           <w:rFonts w:ascii="Calibri" w:eastAsia="Calibri" w:hAnsi="Calibri" w:cs="Calibri"/>
           <w:u w:val="single"/>
           <w:lang w:val="pt-BR"/>
         </w:rPr>
-        <w:t>D  é o índice de divergência ou grau de desvio</w:t>
+        <w:t>D  é</w:t>
+      </w:r>
+      <w:proofErr w:type="gramEnd"/>
+      <w:r>
+        <w:rPr>
+          <w:rFonts w:ascii="Calibri" w:eastAsia="Calibri" w:hAnsi="Calibri" w:cs="Calibri"/>
+          <w:u w:val="single"/>
+          <w:lang w:val="pt-BR"/>
+        </w:rPr>
+        <w:t xml:space="preserve"> o índice de divergência ou grau de desvio</w:t>
       </w:r>
       <w:r>
         <w:rPr>
@@ -651,14 +801,73 @@
           <w:bCs/>
           <w:lang w:val="pt-BR"/>
         </w:rPr>
-        <w:t>No sistema Prosync</w:t>
+        <w:t xml:space="preserve">No sistema </w:t>
+      </w:r>
+      <w:proofErr w:type="spellStart"/>
+      <w:proofErr w:type="gramStart"/>
+      <w:r>
+        <w:rPr>
+          <w:rFonts w:ascii="Calibri" w:eastAsia="Calibri" w:hAnsi="Calibri" w:cs="Calibri"/>
+          <w:b/>
+          <w:bCs/>
+          <w:lang w:val="pt-BR"/>
+        </w:rPr>
+        <w:t>Prosync</w:t>
+      </w:r>
+      <w:proofErr w:type="spellEnd"/>
+      <w:r>
+        <w:rPr>
+          <w:rFonts w:ascii="Calibri" w:eastAsia="Calibri" w:hAnsi="Calibri" w:cs="Calibri"/>
+          <w:lang w:val="pt-BR"/>
+        </w:rPr>
+        <w:t xml:space="preserve"> ,</w:t>
+      </w:r>
+      <w:proofErr w:type="gramEnd"/>
+      <w:r>
+        <w:rPr>
+          <w:rFonts w:ascii="Calibri" w:eastAsia="Calibri" w:hAnsi="Calibri" w:cs="Calibri"/>
+          <w:lang w:val="pt-BR"/>
+        </w:rPr>
+        <w:t xml:space="preserve"> os resultados da </w:t>
+      </w:r>
+      <w:proofErr w:type="gramStart"/>
+      <w:r>
+        <w:rPr>
+          <w:rFonts w:ascii="Calibri" w:eastAsia="Calibri" w:hAnsi="Calibri" w:cs="Calibri"/>
+          <w:lang w:val="pt-BR"/>
+        </w:rPr>
+        <w:t>análise  são</w:t>
+      </w:r>
+      <w:proofErr w:type="gramEnd"/>
+      <w:r>
+        <w:rPr>
+          <w:rFonts w:ascii="Calibri" w:eastAsia="Calibri" w:hAnsi="Calibri" w:cs="Calibri"/>
+          <w:lang w:val="pt-BR"/>
+        </w:rPr>
+        <w:t xml:space="preserve"> apresentados no formato D = X/Y, onde: X = frequência do microrganismo ou substância analisada </w:t>
+      </w:r>
+      <w:proofErr w:type="gramStart"/>
+      <w:r>
+        <w:rPr>
+          <w:rFonts w:ascii="Calibri" w:eastAsia="Calibri" w:hAnsi="Calibri" w:cs="Calibri"/>
+          <w:lang w:val="pt-BR"/>
+        </w:rPr>
+        <w:t>e  Y</w:t>
+      </w:r>
+      <w:proofErr w:type="gramEnd"/>
+      <w:r>
+        <w:rPr>
+          <w:rFonts w:ascii="Calibri" w:eastAsia="Calibri" w:hAnsi="Calibri" w:cs="Calibri"/>
+          <w:lang w:val="pt-BR"/>
+        </w:rPr>
+        <w:t xml:space="preserve"> = frequência do paciente.</w:t>
       </w:r>
       <w:r>
         <w:rPr>
           <w:rFonts w:ascii="Calibri" w:eastAsia="Calibri" w:hAnsi="Calibri" w:cs="Calibri"/>
           <w:lang w:val="pt-BR"/>
         </w:rPr>
-        <w:t xml:space="preserve"> , os resultados da análise  são apresentados no formato D = X/Y, onde: X = frequência do microrganismo ou substância analisada e  Y = frequência do paciente.</w:t>
+        <w:t xml:space="preserve"> </w:t>
       </w:r>
     </w:p>
     <w:p>
@@ -683,17 +892,24 @@
           <w:rFonts w:ascii="Calibri" w:eastAsia="Calibri" w:hAnsi="Calibri" w:cs="Calibri"/>
           <w:lang w:val="pt-BR"/>
         </w:rPr>
-        <w:t>O sistema considera o desvio padrão de ±10%  de X em relação ao valor de Y. Quando X está mais de 10% acima ou abaixo de Y indica divergência e possível reatividade bioenergética ou um processo inflamatório relacionado ao agente testado.</w:t>
+        <w:t>O sistema considera o desvio padrão de ±10</w:t>
       </w:r>
-    </w:p>
-    <w:p>
-      <w:pPr>
-        <w:spacing w:after="0" w:line="240" w:lineRule="auto"/>
+      <w:proofErr w:type="gramStart"/>
+      <w:r>
         <w:rPr>
           <w:rFonts w:ascii="Calibri" w:eastAsia="Calibri" w:hAnsi="Calibri" w:cs="Calibri"/>
           <w:lang w:val="pt-BR"/>
         </w:rPr>
-      </w:pPr>
+        <w:t>%  de</w:t>
+      </w:r>
+      <w:proofErr w:type="gramEnd"/>
+      <w:r>
+        <w:rPr>
+          <w:rFonts w:ascii="Calibri" w:eastAsia="Calibri" w:hAnsi="Calibri" w:cs="Calibri"/>
+          <w:lang w:val="pt-BR"/>
+        </w:rPr>
+        <w:t xml:space="preserve"> X em relação ao valor de Y. Quando X está mais de 10% acima ou abaixo de Y indica divergência e possível reatividade bioenergética ou um processo inflamatório relacionado ao agente testado.</w:t>
+      </w:r>
     </w:p>
     <w:p>
       <w:pPr>
@@ -747,12 +963,14 @@
                 <w:rFonts w:ascii="Calibri" w:eastAsia="Calibri" w:hAnsi="Calibri" w:cs="Calibri"/>
               </w:rPr>
             </w:pPr>
+            <w:proofErr w:type="spellStart"/>
             <w:r>
               <w:rPr>
                 <w:rFonts w:ascii="Calibri" w:eastAsia="Calibri" w:hAnsi="Calibri" w:cs="Calibri"/>
               </w:rPr>
               <w:t>Aspectos</w:t>
             </w:r>
+            <w:proofErr w:type="spellEnd"/>
           </w:p>
         </w:tc>
         <w:tc>
@@ -801,12 +1019,14 @@
                 <w:rFonts w:ascii="Calibri" w:eastAsia="Calibri" w:hAnsi="Calibri" w:cs="Calibri"/>
               </w:rPr>
             </w:pPr>
+            <w:proofErr w:type="spellStart"/>
             <w:r>
               <w:rPr>
                 <w:rFonts w:ascii="Calibri" w:eastAsia="Calibri" w:hAnsi="Calibri" w:cs="Calibri"/>
               </w:rPr>
               <w:t>Interpretação</w:t>
             </w:r>
+            <w:proofErr w:type="spellEnd"/>
           </w:p>
         </w:tc>
       </w:tr>
@@ -827,6 +1047,7 @@
                 <w:szCs w:val="20"/>
               </w:rPr>
             </w:pPr>
+            <w:proofErr w:type="spellStart"/>
             <w:r>
               <w:rPr>
                 <w:rFonts w:ascii="Calibri" w:eastAsia="Calibri" w:hAnsi="Calibri" w:cs="Calibri"/>
@@ -835,6 +1056,7 @@
               </w:rPr>
               <w:t>Microrganismos</w:t>
             </w:r>
+            <w:proofErr w:type="spellEnd"/>
           </w:p>
         </w:tc>
         <w:tc>
@@ -1115,6 +1337,7 @@
                 <w:szCs w:val="20"/>
               </w:rPr>
             </w:pPr>
+            <w:proofErr w:type="spellStart"/>
             <w:r>
               <w:rPr>
                 <w:rFonts w:ascii="Calibri" w:eastAsia="Calibri" w:hAnsi="Calibri" w:cs="Calibri"/>
@@ -1123,6 +1346,7 @@
               </w:rPr>
               <w:t>Toxinas</w:t>
             </w:r>
+            <w:proofErr w:type="spellEnd"/>
           </w:p>
         </w:tc>
         <w:tc>
@@ -1510,13 +1734,41 @@
               </w:rPr>
               <w:t xml:space="preserve">Não ressoa com o organismo. </w:t>
             </w:r>
+            <w:proofErr w:type="spellStart"/>
             <w:r>
               <w:rPr>
                 <w:rFonts w:ascii="Calibri" w:eastAsia="Calibri" w:hAnsi="Calibri" w:cs="Calibri"/>
                 <w:sz w:val="20"/>
                 <w:szCs w:val="20"/>
               </w:rPr>
-              <w:t>Ausência de carga tóxica.</w:t>
+              <w:t>Ausência</w:t>
+            </w:r>
+            <w:proofErr w:type="spellEnd"/>
+            <w:r>
+              <w:rPr>
+                <w:rFonts w:ascii="Calibri" w:eastAsia="Calibri" w:hAnsi="Calibri" w:cs="Calibri"/>
+                <w:sz w:val="20"/>
+                <w:szCs w:val="20"/>
+              </w:rPr>
+              <w:t xml:space="preserve"> de carga </w:t>
+            </w:r>
+            <w:proofErr w:type="spellStart"/>
+            <w:r>
+              <w:rPr>
+                <w:rFonts w:ascii="Calibri" w:eastAsia="Calibri" w:hAnsi="Calibri" w:cs="Calibri"/>
+                <w:sz w:val="20"/>
+                <w:szCs w:val="20"/>
+              </w:rPr>
+              <w:t>tóxica</w:t>
+            </w:r>
+            <w:proofErr w:type="spellEnd"/>
+            <w:r>
+              <w:rPr>
+                <w:rFonts w:ascii="Calibri" w:eastAsia="Calibri" w:hAnsi="Calibri" w:cs="Calibri"/>
+                <w:sz w:val="20"/>
+                <w:szCs w:val="20"/>
+              </w:rPr>
+              <w:t>.</w:t>
             </w:r>
           </w:p>
         </w:tc>
@@ -1555,8 +1807,18 @@
                 <w:sz w:val="20"/>
                 <w:szCs w:val="20"/>
               </w:rPr>
-              <w:t>Campo morfogenético</w:t>
+              <w:t xml:space="preserve">Campo </w:t>
             </w:r>
+            <w:proofErr w:type="spellStart"/>
+            <w:r>
+              <w:rPr>
+                <w:rFonts w:ascii="Calibri" w:eastAsia="Calibri" w:hAnsi="Calibri" w:cs="Calibri"/>
+                <w:sz w:val="20"/>
+                <w:szCs w:val="20"/>
+              </w:rPr>
+              <w:t>morfogenético</w:t>
+            </w:r>
+            <w:proofErr w:type="spellEnd"/>
           </w:p>
         </w:tc>
         <w:tc>
@@ -1635,7 +1897,27 @@
                 <w:szCs w:val="20"/>
                 <w:lang w:val="pt-BR"/>
               </w:rPr>
-              <w:t>Emoção ativa e ressoante que está afetando os campos  emocional/mental no momento.</w:t>
+              <w:t xml:space="preserve">Emoção ativa e ressoante que está afetando os </w:t>
+            </w:r>
+            <w:proofErr w:type="gramStart"/>
+            <w:r>
+              <w:rPr>
+                <w:rFonts w:ascii="Calibri" w:eastAsia="Calibri" w:hAnsi="Calibri" w:cs="Calibri"/>
+                <w:sz w:val="20"/>
+                <w:szCs w:val="20"/>
+                <w:lang w:val="pt-BR"/>
+              </w:rPr>
+              <w:t>campos  emocional</w:t>
+            </w:r>
+            <w:proofErr w:type="gramEnd"/>
+            <w:r>
+              <w:rPr>
+                <w:rFonts w:ascii="Calibri" w:eastAsia="Calibri" w:hAnsi="Calibri" w:cs="Calibri"/>
+                <w:sz w:val="20"/>
+                <w:szCs w:val="20"/>
+                <w:lang w:val="pt-BR"/>
+              </w:rPr>
+              <w:t>/mental no momento.</w:t>
             </w:r>
           </w:p>
         </w:tc>
@@ -1753,7 +2035,115 @@
                 <w:sz w:val="20"/>
                 <w:szCs w:val="20"/>
               </w:rPr>
-              <w:t>Pode estar ligada a memórias ou padrões recorrentes.</w:t>
+              <w:t xml:space="preserve">Pode </w:t>
+            </w:r>
+            <w:proofErr w:type="spellStart"/>
+            <w:r>
+              <w:rPr>
+                <w:rFonts w:ascii="Calibri" w:eastAsia="Calibri" w:hAnsi="Calibri" w:cs="Calibri"/>
+                <w:sz w:val="20"/>
+                <w:szCs w:val="20"/>
+              </w:rPr>
+              <w:t>estar</w:t>
+            </w:r>
+            <w:proofErr w:type="spellEnd"/>
+            <w:r>
+              <w:rPr>
+                <w:rFonts w:ascii="Calibri" w:eastAsia="Calibri" w:hAnsi="Calibri" w:cs="Calibri"/>
+                <w:sz w:val="20"/>
+                <w:szCs w:val="20"/>
+              </w:rPr>
+              <w:t xml:space="preserve"> </w:t>
+            </w:r>
+            <w:proofErr w:type="spellStart"/>
+            <w:r>
+              <w:rPr>
+                <w:rFonts w:ascii="Calibri" w:eastAsia="Calibri" w:hAnsi="Calibri" w:cs="Calibri"/>
+                <w:sz w:val="20"/>
+                <w:szCs w:val="20"/>
+              </w:rPr>
+              <w:t>ligada</w:t>
+            </w:r>
+            <w:proofErr w:type="spellEnd"/>
+            <w:r>
+              <w:rPr>
+                <w:rFonts w:ascii="Calibri" w:eastAsia="Calibri" w:hAnsi="Calibri" w:cs="Calibri"/>
+                <w:sz w:val="20"/>
+                <w:szCs w:val="20"/>
+              </w:rPr>
+              <w:t xml:space="preserve"> a </w:t>
+            </w:r>
+            <w:proofErr w:type="spellStart"/>
+            <w:r>
+              <w:rPr>
+                <w:rFonts w:ascii="Calibri" w:eastAsia="Calibri" w:hAnsi="Calibri" w:cs="Calibri"/>
+                <w:sz w:val="20"/>
+                <w:szCs w:val="20"/>
+              </w:rPr>
+              <w:t>memórias</w:t>
+            </w:r>
+            <w:proofErr w:type="spellEnd"/>
+            <w:r>
+              <w:rPr>
+                <w:rFonts w:ascii="Calibri" w:eastAsia="Calibri" w:hAnsi="Calibri" w:cs="Calibri"/>
+                <w:sz w:val="20"/>
+                <w:szCs w:val="20"/>
+              </w:rPr>
+              <w:t xml:space="preserve"> </w:t>
+            </w:r>
+            <w:proofErr w:type="spellStart"/>
+            <w:r>
+              <w:rPr>
+                <w:rFonts w:ascii="Calibri" w:eastAsia="Calibri" w:hAnsi="Calibri" w:cs="Calibri"/>
+                <w:sz w:val="20"/>
+                <w:szCs w:val="20"/>
+              </w:rPr>
+              <w:t>ou</w:t>
+            </w:r>
+            <w:proofErr w:type="spellEnd"/>
+            <w:r>
+              <w:rPr>
+                <w:rFonts w:ascii="Calibri" w:eastAsia="Calibri" w:hAnsi="Calibri" w:cs="Calibri"/>
+                <w:sz w:val="20"/>
+                <w:szCs w:val="20"/>
+              </w:rPr>
+              <w:t xml:space="preserve"> </w:t>
+            </w:r>
+            <w:proofErr w:type="spellStart"/>
+            <w:r>
+              <w:rPr>
+                <w:rFonts w:ascii="Calibri" w:eastAsia="Calibri" w:hAnsi="Calibri" w:cs="Calibri"/>
+                <w:sz w:val="20"/>
+                <w:szCs w:val="20"/>
+              </w:rPr>
+              <w:t>padrões</w:t>
+            </w:r>
+            <w:proofErr w:type="spellEnd"/>
+            <w:r>
+              <w:rPr>
+                <w:rFonts w:ascii="Calibri" w:eastAsia="Calibri" w:hAnsi="Calibri" w:cs="Calibri"/>
+                <w:sz w:val="20"/>
+                <w:szCs w:val="20"/>
+              </w:rPr>
+              <w:t xml:space="preserve"> </w:t>
+            </w:r>
+            <w:proofErr w:type="spellStart"/>
+            <w:r>
+              <w:rPr>
+                <w:rFonts w:ascii="Calibri" w:eastAsia="Calibri" w:hAnsi="Calibri" w:cs="Calibri"/>
+                <w:sz w:val="20"/>
+                <w:szCs w:val="20"/>
+              </w:rPr>
+              <w:t>recorrentes</w:t>
+            </w:r>
+            <w:proofErr w:type="spellEnd"/>
+            <w:r>
+              <w:rPr>
+                <w:rFonts w:ascii="Calibri" w:eastAsia="Calibri" w:hAnsi="Calibri" w:cs="Calibri"/>
+                <w:sz w:val="20"/>
+                <w:szCs w:val="20"/>
+              </w:rPr>
+              <w:t>.</w:t>
             </w:r>
           </w:p>
         </w:tc>
@@ -2430,6 +2820,7 @@
                 <w:rFonts w:ascii="Calibri" w:eastAsia="Calibri" w:hAnsi="Calibri" w:cs="Calibri"/>
                 <w:b/>
                 <w:bCs/>
+                <w:lang w:val="pt-BR"/>
               </w:rPr>
             </w:pPr>
             <w:r>
@@ -2437,8 +2828,9 @@
                 <w:rFonts w:ascii="Calibri" w:eastAsia="Calibri" w:hAnsi="Calibri" w:cs="Calibri"/>
                 <w:b/>
                 <w:bCs/>
-              </w:rPr>
-              <w:t>MICRORGANISMOS DETECTADOS</w:t>
+                <w:lang w:val="pt-BR"/>
+              </w:rPr>
+              <w:t>MICRORGANISMOS DETECTADOS NO OBERON/META HUNTER</w:t>
             </w:r>
           </w:p>
         </w:tc>
@@ -2488,7 +2880,15 @@
                 <w:b/>
                 <w:bCs/>
               </w:rPr>
-              <w:t>SINTOMAS COMUNS</w:t>
+              <w:t xml:space="preserve">SINTOMAS </w:t>
+            </w:r>
+            <w:r>
+              <w:rPr>
+                <w:rFonts w:ascii="Calibri" w:eastAsia="Calibri" w:hAnsi="Calibri" w:cs="Calibri"/>
+                <w:b/>
+                <w:bCs/>
+              </w:rPr>
+              <w:t>FREQUENTES</w:t>
             </w:r>
           </w:p>
         </w:tc>
@@ -2545,7 +2945,21 @@
               <w:rPr>
                 <w:rFonts w:ascii="Calibri" w:eastAsia="Calibri" w:hAnsi="Calibri" w:cs="Calibri"/>
               </w:rPr>
-              <w:t>tr for item in table_microorganism%}</w:t>
+              <w:t xml:space="preserve">tr for item in </w:t>
+            </w:r>
+            <w:proofErr w:type="spellStart"/>
+            <w:r>
+              <w:rPr>
+                <w:rFonts w:ascii="Calibri" w:eastAsia="Calibri" w:hAnsi="Calibri" w:cs="Calibri"/>
+              </w:rPr>
+              <w:t>table_microorganism</w:t>
+            </w:r>
+            <w:proofErr w:type="spellEnd"/>
+            <w:r>
+              <w:rPr>
+                <w:rFonts w:ascii="Calibri" w:eastAsia="Calibri" w:hAnsi="Calibri" w:cs="Calibri"/>
+              </w:rPr>
+              <w:t>%}</w:t>
             </w:r>
           </w:p>
         </w:tc>
@@ -2561,7 +2975,6 @@
           <w:p>
             <w:pPr>
               <w:spacing w:after="0" w:line="240" w:lineRule="auto"/>
-              <w:jc w:val="center"/>
               <w:rPr>
                 <w:rFonts w:ascii="Calibri" w:eastAsia="Calibri" w:hAnsi="Calibri" w:cs="Calibri"/>
               </w:rPr>
@@ -2570,7 +2983,23 @@
               <w:rPr>
                 <w:rFonts w:ascii="Calibri" w:eastAsia="Calibri" w:hAnsi="Calibri" w:cs="Calibri"/>
               </w:rPr>
-              <w:t>{{item.nome}}</w:t>
+              <w:t>{{</w:t>
+            </w:r>
+            <w:proofErr w:type="spellStart"/>
+            <w:proofErr w:type="gramStart"/>
+            <w:r>
+              <w:rPr>
+                <w:rFonts w:ascii="Calibri" w:eastAsia="Calibri" w:hAnsi="Calibri" w:cs="Calibri"/>
+              </w:rPr>
+              <w:t>item.nome</w:t>
+            </w:r>
+            <w:proofErr w:type="spellEnd"/>
+            <w:proofErr w:type="gramEnd"/>
+            <w:r>
+              <w:rPr>
+                <w:rFonts w:ascii="Calibri" w:eastAsia="Calibri" w:hAnsi="Calibri" w:cs="Calibri"/>
+              </w:rPr>
+              <w:t>}}</w:t>
             </w:r>
           </w:p>
         </w:tc>
@@ -2590,7 +3019,23 @@
               <w:rPr>
                 <w:rFonts w:ascii="Calibri" w:eastAsia="Calibri" w:hAnsi="Calibri" w:cs="Calibri"/>
               </w:rPr>
-              <w:t>{{item.tipo}}</w:t>
+              <w:t>{{</w:t>
+            </w:r>
+            <w:proofErr w:type="spellStart"/>
+            <w:proofErr w:type="gramStart"/>
+            <w:r>
+              <w:rPr>
+                <w:rFonts w:ascii="Calibri" w:eastAsia="Calibri" w:hAnsi="Calibri" w:cs="Calibri"/>
+              </w:rPr>
+              <w:t>item.tipo</w:t>
+            </w:r>
+            <w:proofErr w:type="spellEnd"/>
+            <w:proofErr w:type="gramEnd"/>
+            <w:r>
+              <w:rPr>
+                <w:rFonts w:ascii="Calibri" w:eastAsia="Calibri" w:hAnsi="Calibri" w:cs="Calibri"/>
+              </w:rPr>
+              <w:t>}}</w:t>
             </w:r>
           </w:p>
         </w:tc>
@@ -2601,7 +3046,6 @@
           <w:p>
             <w:pPr>
               <w:spacing w:after="0" w:line="240" w:lineRule="auto"/>
-              <w:jc w:val="center"/>
               <w:rPr>
                 <w:rFonts w:ascii="Calibri" w:eastAsia="Calibri" w:hAnsi="Calibri" w:cs="Calibri"/>
               </w:rPr>
@@ -2610,7 +3054,15 @@
               <w:rPr>
                 <w:rFonts w:ascii="Calibri" w:eastAsia="Calibri" w:hAnsi="Calibri" w:cs="Calibri"/>
               </w:rPr>
-              <w:t>{{item.</w:t>
+              <w:t>{{</w:t>
+            </w:r>
+            <w:proofErr w:type="spellStart"/>
+            <w:proofErr w:type="gramStart"/>
+            <w:r>
+              <w:rPr>
+                <w:rFonts w:ascii="Calibri" w:eastAsia="Calibri" w:hAnsi="Calibri" w:cs="Calibri"/>
+              </w:rPr>
+              <w:t>item.</w:t>
             </w:r>
             <w:r>
               <w:rPr>
@@ -2618,6 +3070,8 @@
               </w:rPr>
               <w:t>sintomas</w:t>
             </w:r>
+            <w:proofErr w:type="spellEnd"/>
+            <w:proofErr w:type="gramEnd"/>
             <w:r>
               <w:rPr>
                 <w:rFonts w:ascii="Calibri" w:eastAsia="Calibri" w:hAnsi="Calibri" w:cs="Calibri"/>
@@ -2642,7 +3096,23 @@
               <w:rPr>
                 <w:rFonts w:ascii="Calibri" w:eastAsia="Calibri" w:hAnsi="Calibri" w:cs="Calibri"/>
               </w:rPr>
-              <w:t>{{item.D}}</w:t>
+              <w:t>{{</w:t>
+            </w:r>
+            <w:proofErr w:type="spellStart"/>
+            <w:proofErr w:type="gramStart"/>
+            <w:r>
+              <w:rPr>
+                <w:rFonts w:ascii="Calibri" w:eastAsia="Calibri" w:hAnsi="Calibri" w:cs="Calibri"/>
+              </w:rPr>
+              <w:t>item.D</w:t>
+            </w:r>
+            <w:proofErr w:type="spellEnd"/>
+            <w:proofErr w:type="gramEnd"/>
+            <w:r>
+              <w:rPr>
+                <w:rFonts w:ascii="Calibri" w:eastAsia="Calibri" w:hAnsi="Calibri" w:cs="Calibri"/>
+              </w:rPr>
+              <w:t>}}</w:t>
             </w:r>
           </w:p>
         </w:tc>
@@ -2668,7 +3138,21 @@
               <w:rPr>
                 <w:rFonts w:ascii="Calibri" w:eastAsia="Calibri" w:hAnsi="Calibri" w:cs="Calibri"/>
               </w:rPr>
-              <w:t>{%tr endfor %}</w:t>
+              <w:t xml:space="preserve">{%tr </w:t>
+            </w:r>
+            <w:proofErr w:type="spellStart"/>
+            <w:r>
+              <w:rPr>
+                <w:rFonts w:ascii="Calibri" w:eastAsia="Calibri" w:hAnsi="Calibri" w:cs="Calibri"/>
+              </w:rPr>
+              <w:t>endfor</w:t>
+            </w:r>
+            <w:proofErr w:type="spellEnd"/>
+            <w:r>
+              <w:rPr>
+                <w:rFonts w:ascii="Calibri" w:eastAsia="Calibri" w:hAnsi="Calibri" w:cs="Calibri"/>
+              </w:rPr>
+              <w:t xml:space="preserve"> %}</w:t>
             </w:r>
           </w:p>
         </w:tc>
@@ -2684,42 +3168,384 @@
           <w:szCs w:val="12"/>
         </w:rPr>
       </w:pPr>
-      <w:bookmarkStart w:id="1" w:name="_heading=h.avy5f2be3e0l" w:colFirst="0" w:colLast="0"/>
-      <w:bookmarkEnd w:id="1"/>
     </w:p>
-    <w:p>
-      <w:pPr>
-        <w:widowControl w:val="0"/>
-        <w:spacing w:after="0"/>
-        <w:rPr>
-          <w:rFonts w:ascii="Calibri" w:eastAsia="Calibri" w:hAnsi="Calibri" w:cs="Calibri"/>
-          <w:sz w:val="12"/>
-          <w:szCs w:val="12"/>
-        </w:rPr>
-      </w:pPr>
-    </w:p>
-    <w:p>
-      <w:pPr>
-        <w:widowControl w:val="0"/>
-        <w:spacing w:after="0"/>
-        <w:rPr>
-          <w:rFonts w:ascii="Calibri" w:eastAsia="Calibri" w:hAnsi="Calibri" w:cs="Calibri"/>
-          <w:sz w:val="12"/>
-          <w:szCs w:val="12"/>
-        </w:rPr>
-      </w:pPr>
-    </w:p>
-    <w:p>
-      <w:pPr>
-        <w:widowControl w:val="0"/>
-        <w:spacing w:after="0"/>
-        <w:rPr>
-          <w:rFonts w:ascii="Calibri" w:eastAsia="Calibri" w:hAnsi="Calibri" w:cs="Calibri"/>
-          <w:sz w:val="12"/>
-          <w:szCs w:val="12"/>
-        </w:rPr>
-      </w:pPr>
-    </w:p>
+    <w:tbl>
+      <w:tblPr>
+        <w:tblW w:w="10593" w:type="dxa"/>
+        <w:tblInd w:w="-108" w:type="dxa"/>
+        <w:tblBorders>
+          <w:top w:val="single" w:sz="4" w:space="0" w:color="000000"/>
+          <w:left w:val="single" w:sz="4" w:space="0" w:color="000000"/>
+          <w:bottom w:val="single" w:sz="4" w:space="0" w:color="000000"/>
+          <w:right w:val="single" w:sz="4" w:space="0" w:color="000000"/>
+          <w:insideH w:val="single" w:sz="4" w:space="0" w:color="000000"/>
+          <w:insideV w:val="single" w:sz="4" w:space="0" w:color="000000"/>
+        </w:tblBorders>
+        <w:tblLayout w:type="fixed"/>
+        <w:tblLook w:val="0400" w:firstRow="0" w:lastRow="0" w:firstColumn="0" w:lastColumn="0" w:noHBand="0" w:noVBand="1"/>
+      </w:tblPr>
+      <w:tblGrid>
+        <w:gridCol w:w="3222"/>
+        <w:gridCol w:w="1276"/>
+        <w:gridCol w:w="4536"/>
+        <w:gridCol w:w="1559"/>
+      </w:tblGrid>
+      <w:tr>
+        <w:trPr>
+          <w:trHeight w:val="279"/>
+        </w:trPr>
+        <w:tc>
+          <w:tcPr>
+            <w:tcW w:w="3222" w:type="dxa"/>
+            <w:shd w:val="clear" w:color="auto" w:fill="D9D9D9"/>
+          </w:tcPr>
+          <w:p>
+            <w:pPr>
+              <w:spacing w:after="0" w:line="240" w:lineRule="auto"/>
+              <w:jc w:val="center"/>
+              <w:rPr>
+                <w:rFonts w:ascii="Calibri" w:eastAsia="Calibri" w:hAnsi="Calibri" w:cs="Calibri"/>
+                <w:b/>
+                <w:bCs/>
+                <w:lang w:val="pt-BR"/>
+              </w:rPr>
+            </w:pPr>
+            <w:r>
+              <w:rPr>
+                <w:rFonts w:ascii="Calibri" w:eastAsia="Calibri" w:hAnsi="Calibri" w:cs="Calibri"/>
+                <w:b/>
+                <w:bCs/>
+                <w:lang w:val="pt-BR"/>
+              </w:rPr>
+              <w:t xml:space="preserve">MICRORGANISMOS DETECTADOS NO </w:t>
+            </w:r>
+            <w:r>
+              <w:rPr>
+                <w:rFonts w:ascii="Calibri" w:eastAsia="Calibri" w:hAnsi="Calibri" w:cs="Calibri"/>
+                <w:b/>
+                <w:bCs/>
+                <w:lang w:val="pt-BR"/>
+              </w:rPr>
+              <w:t>PROSYNC</w:t>
+            </w:r>
+          </w:p>
+        </w:tc>
+        <w:tc>
+          <w:tcPr>
+            <w:tcW w:w="1276" w:type="dxa"/>
+            <w:shd w:val="clear" w:color="auto" w:fill="D9D9D9"/>
+          </w:tcPr>
+          <w:p>
+            <w:pPr>
+              <w:spacing w:after="0" w:line="240" w:lineRule="auto"/>
+              <w:jc w:val="center"/>
+              <w:rPr>
+                <w:rFonts w:ascii="Calibri" w:eastAsia="Calibri" w:hAnsi="Calibri" w:cs="Calibri"/>
+                <w:b/>
+                <w:bCs/>
+              </w:rPr>
+            </w:pPr>
+            <w:r>
+              <w:rPr>
+                <w:rFonts w:ascii="Calibri" w:eastAsia="Calibri" w:hAnsi="Calibri" w:cs="Calibri"/>
+                <w:b/>
+                <w:bCs/>
+              </w:rPr>
+              <w:t>TIPO</w:t>
+            </w:r>
+          </w:p>
+        </w:tc>
+        <w:tc>
+          <w:tcPr>
+            <w:tcW w:w="4536" w:type="dxa"/>
+            <w:shd w:val="clear" w:color="auto" w:fill="D9D9D9"/>
+          </w:tcPr>
+          <w:p>
+            <w:pPr>
+              <w:spacing w:after="0" w:line="240" w:lineRule="auto"/>
+              <w:jc w:val="center"/>
+              <w:rPr>
+                <w:rFonts w:ascii="Calibri" w:eastAsia="Calibri" w:hAnsi="Calibri" w:cs="Calibri"/>
+                <w:b/>
+                <w:bCs/>
+              </w:rPr>
+            </w:pPr>
+            <w:r>
+              <w:rPr>
+                <w:rFonts w:ascii="Calibri" w:eastAsia="Calibri" w:hAnsi="Calibri" w:cs="Calibri"/>
+                <w:b/>
+                <w:bCs/>
+              </w:rPr>
+              <w:t>SINTOMAS FREQUENTES</w:t>
+            </w:r>
+          </w:p>
+        </w:tc>
+        <w:tc>
+          <w:tcPr>
+            <w:tcW w:w="1559" w:type="dxa"/>
+            <w:shd w:val="clear" w:color="auto" w:fill="D9D9D9"/>
+          </w:tcPr>
+          <w:p>
+            <w:pPr>
+              <w:spacing w:after="0" w:line="240" w:lineRule="auto"/>
+              <w:jc w:val="center"/>
+              <w:rPr>
+                <w:rFonts w:ascii="Calibri" w:eastAsia="Calibri" w:hAnsi="Calibri" w:cs="Calibri"/>
+                <w:b/>
+                <w:bCs/>
+              </w:rPr>
+            </w:pPr>
+            <w:r>
+              <w:rPr>
+                <w:rFonts w:ascii="Calibri" w:eastAsia="Calibri" w:hAnsi="Calibri" w:cs="Calibri"/>
+                <w:b/>
+                <w:bCs/>
+              </w:rPr>
+              <w:t>D</w:t>
+            </w:r>
+          </w:p>
+        </w:tc>
+      </w:tr>
+      <w:tr>
+        <w:trPr>
+          <w:trHeight w:val="279"/>
+        </w:trPr>
+        <w:tc>
+          <w:tcPr>
+            <w:tcW w:w="10593" w:type="dxa"/>
+            <w:gridSpan w:val="4"/>
+          </w:tcPr>
+          <w:p>
+            <w:pPr>
+              <w:spacing w:after="0" w:line="240" w:lineRule="auto"/>
+              <w:jc w:val="center"/>
+              <w:rPr>
+                <w:rFonts w:ascii="Calibri" w:eastAsia="Calibri" w:hAnsi="Calibri" w:cs="Calibri"/>
+              </w:rPr>
+            </w:pPr>
+            <w:r>
+              <w:rPr>
+                <w:rFonts w:ascii="Calibri" w:eastAsia="Calibri" w:hAnsi="Calibri" w:cs="Calibri"/>
+              </w:rPr>
+              <w:t xml:space="preserve">{%tr for item in </w:t>
+            </w:r>
+            <w:proofErr w:type="spellStart"/>
+            <w:r>
+              <w:rPr>
+                <w:rFonts w:ascii="Calibri" w:eastAsia="Calibri" w:hAnsi="Calibri" w:cs="Calibri"/>
+              </w:rPr>
+              <w:t>tab</w:t>
+            </w:r>
+            <w:r>
+              <w:rPr>
+                <w:rFonts w:ascii="Calibri" w:eastAsia="Calibri" w:hAnsi="Calibri" w:cs="Calibri"/>
+              </w:rPr>
+              <w:t>le_prosync</w:t>
+            </w:r>
+            <w:proofErr w:type="spellEnd"/>
+            <w:r>
+              <w:rPr>
+                <w:rFonts w:ascii="Calibri" w:eastAsia="Calibri" w:hAnsi="Calibri" w:cs="Calibri"/>
+              </w:rPr>
+              <w:t xml:space="preserve"> </w:t>
+            </w:r>
+            <w:r>
+              <w:rPr>
+                <w:rFonts w:ascii="Calibri" w:eastAsia="Calibri" w:hAnsi="Calibri" w:cs="Calibri"/>
+              </w:rPr>
+              <w:t>%}</w:t>
+            </w:r>
+          </w:p>
+        </w:tc>
+      </w:tr>
+      <w:tr>
+        <w:trPr>
+          <w:trHeight w:val="279"/>
+        </w:trPr>
+        <w:tc>
+          <w:tcPr>
+            <w:tcW w:w="3222" w:type="dxa"/>
+          </w:tcPr>
+          <w:p>
+            <w:pPr>
+              <w:spacing w:after="0" w:line="240" w:lineRule="auto"/>
+              <w:rPr>
+                <w:rFonts w:ascii="Calibri" w:eastAsia="Calibri" w:hAnsi="Calibri" w:cs="Calibri"/>
+              </w:rPr>
+            </w:pPr>
+            <w:r>
+              <w:rPr>
+                <w:rFonts w:ascii="Calibri" w:eastAsia="Calibri" w:hAnsi="Calibri" w:cs="Calibri"/>
+              </w:rPr>
+              <w:t>{{</w:t>
+            </w:r>
+            <w:proofErr w:type="spellStart"/>
+            <w:proofErr w:type="gramStart"/>
+            <w:r>
+              <w:rPr>
+                <w:rFonts w:ascii="Calibri" w:eastAsia="Calibri" w:hAnsi="Calibri" w:cs="Calibri"/>
+              </w:rPr>
+              <w:t>item.nome</w:t>
+            </w:r>
+            <w:proofErr w:type="spellEnd"/>
+            <w:proofErr w:type="gramEnd"/>
+            <w:r>
+              <w:rPr>
+                <w:rFonts w:ascii="Calibri" w:eastAsia="Calibri" w:hAnsi="Calibri" w:cs="Calibri"/>
+              </w:rPr>
+              <w:t>}}</w:t>
+            </w:r>
+          </w:p>
+        </w:tc>
+        <w:tc>
+          <w:tcPr>
+            <w:tcW w:w="1276" w:type="dxa"/>
+          </w:tcPr>
+          <w:p>
+            <w:pPr>
+              <w:spacing w:after="0" w:line="240" w:lineRule="auto"/>
+              <w:jc w:val="center"/>
+              <w:rPr>
+                <w:rFonts w:ascii="Calibri" w:eastAsia="Calibri" w:hAnsi="Calibri" w:cs="Calibri"/>
+              </w:rPr>
+            </w:pPr>
+            <w:r>
+              <w:rPr>
+                <w:rFonts w:ascii="Calibri" w:eastAsia="Calibri" w:hAnsi="Calibri" w:cs="Calibri"/>
+              </w:rPr>
+              <w:t>{{</w:t>
+            </w:r>
+            <w:proofErr w:type="spellStart"/>
+            <w:proofErr w:type="gramStart"/>
+            <w:r>
+              <w:rPr>
+                <w:rFonts w:ascii="Calibri" w:eastAsia="Calibri" w:hAnsi="Calibri" w:cs="Calibri"/>
+              </w:rPr>
+              <w:t>item.tipo</w:t>
+            </w:r>
+            <w:proofErr w:type="spellEnd"/>
+            <w:proofErr w:type="gramEnd"/>
+            <w:r>
+              <w:rPr>
+                <w:rFonts w:ascii="Calibri" w:eastAsia="Calibri" w:hAnsi="Calibri" w:cs="Calibri"/>
+              </w:rPr>
+              <w:t>}}</w:t>
+            </w:r>
+          </w:p>
+        </w:tc>
+        <w:tc>
+          <w:tcPr>
+            <w:tcW w:w="4536" w:type="dxa"/>
+          </w:tcPr>
+          <w:p>
+            <w:pPr>
+              <w:spacing w:after="0" w:line="240" w:lineRule="auto"/>
+              <w:rPr>
+                <w:rFonts w:ascii="Calibri" w:eastAsia="Calibri" w:hAnsi="Calibri" w:cs="Calibri"/>
+              </w:rPr>
+            </w:pPr>
+            <w:r>
+              <w:rPr>
+                <w:rFonts w:ascii="Calibri" w:eastAsia="Calibri" w:hAnsi="Calibri" w:cs="Calibri"/>
+              </w:rPr>
+              <w:t>{{</w:t>
+            </w:r>
+            <w:proofErr w:type="spellStart"/>
+            <w:proofErr w:type="gramStart"/>
+            <w:r>
+              <w:rPr>
+                <w:rFonts w:ascii="Calibri" w:eastAsia="Calibri" w:hAnsi="Calibri" w:cs="Calibri"/>
+              </w:rPr>
+              <w:t>item.sintomas</w:t>
+            </w:r>
+            <w:proofErr w:type="spellEnd"/>
+            <w:proofErr w:type="gramEnd"/>
+            <w:r>
+              <w:rPr>
+                <w:rFonts w:ascii="Calibri" w:eastAsia="Calibri" w:hAnsi="Calibri" w:cs="Calibri"/>
+              </w:rPr>
+              <w:t>}}</w:t>
+            </w:r>
+          </w:p>
+        </w:tc>
+        <w:tc>
+          <w:tcPr>
+            <w:tcW w:w="1559" w:type="dxa"/>
+          </w:tcPr>
+          <w:p>
+            <w:pPr>
+              <w:spacing w:after="0" w:line="240" w:lineRule="auto"/>
+              <w:jc w:val="center"/>
+              <w:rPr>
+                <w:rFonts w:ascii="Calibri" w:eastAsia="Calibri" w:hAnsi="Calibri" w:cs="Calibri"/>
+              </w:rPr>
+            </w:pPr>
+            <w:r>
+              <w:rPr>
+                <w:rFonts w:ascii="Calibri" w:eastAsia="Calibri" w:hAnsi="Calibri" w:cs="Calibri"/>
+              </w:rPr>
+              <w:t>{{</w:t>
+            </w:r>
+            <w:proofErr w:type="spellStart"/>
+            <w:proofErr w:type="gramStart"/>
+            <w:r>
+              <w:rPr>
+                <w:rFonts w:ascii="Calibri" w:eastAsia="Calibri" w:hAnsi="Calibri" w:cs="Calibri"/>
+              </w:rPr>
+              <w:t>item.D</w:t>
+            </w:r>
+            <w:proofErr w:type="spellEnd"/>
+            <w:proofErr w:type="gramEnd"/>
+            <w:r>
+              <w:rPr>
+                <w:rFonts w:ascii="Calibri" w:eastAsia="Calibri" w:hAnsi="Calibri" w:cs="Calibri"/>
+              </w:rPr>
+              <w:t>}}</w:t>
+            </w:r>
+          </w:p>
+        </w:tc>
+      </w:tr>
+      <w:tr>
+        <w:trPr>
+          <w:trHeight w:val="279"/>
+        </w:trPr>
+        <w:tc>
+          <w:tcPr>
+            <w:tcW w:w="10593" w:type="dxa"/>
+            <w:gridSpan w:val="4"/>
+          </w:tcPr>
+          <w:p>
+            <w:pPr>
+              <w:spacing w:after="0" w:line="240" w:lineRule="auto"/>
+              <w:jc w:val="center"/>
+              <w:rPr>
+                <w:rFonts w:ascii="Calibri" w:eastAsia="Calibri" w:hAnsi="Calibri" w:cs="Calibri"/>
+              </w:rPr>
+            </w:pPr>
+            <w:r>
+              <w:rPr>
+                <w:rFonts w:ascii="Calibri" w:eastAsia="Calibri" w:hAnsi="Calibri" w:cs="Calibri"/>
+              </w:rPr>
+              <w:t xml:space="preserve">{%tr </w:t>
+            </w:r>
+            <w:proofErr w:type="spellStart"/>
+            <w:r>
+              <w:rPr>
+                <w:rFonts w:ascii="Calibri" w:eastAsia="Calibri" w:hAnsi="Calibri" w:cs="Calibri"/>
+              </w:rPr>
+              <w:t>endfor</w:t>
+            </w:r>
+            <w:proofErr w:type="spellEnd"/>
+            <w:r>
+              <w:rPr>
+                <w:rFonts w:ascii="Calibri" w:eastAsia="Calibri" w:hAnsi="Calibri" w:cs="Calibri"/>
+              </w:rPr>
+              <w:t xml:space="preserve"> %}</w:t>
+            </w:r>
+          </w:p>
+        </w:tc>
+      </w:tr>
+    </w:tbl>
     <w:p>
       <w:pPr>
         <w:widowControl w:val="0"/>
@@ -2849,7 +3675,25 @@
                 <w:b/>
                 <w:bCs/>
               </w:rPr>
-              <w:t>{%tr for item in table_toxins%}</w:t>
+              <w:t xml:space="preserve">{%tr for item in </w:t>
+            </w:r>
+            <w:proofErr w:type="spellStart"/>
+            <w:r>
+              <w:rPr>
+                <w:rFonts w:ascii="Calibri" w:eastAsia="Calibri" w:hAnsi="Calibri" w:cs="Calibri"/>
+                <w:b/>
+                <w:bCs/>
+              </w:rPr>
+              <w:t>table_toxins</w:t>
+            </w:r>
+            <w:proofErr w:type="spellEnd"/>
+            <w:r>
+              <w:rPr>
+                <w:rFonts w:ascii="Calibri" w:eastAsia="Calibri" w:hAnsi="Calibri" w:cs="Calibri"/>
+                <w:b/>
+                <w:bCs/>
+              </w:rPr>
+              <w:t>%}</w:t>
             </w:r>
           </w:p>
         </w:tc>
@@ -2870,13 +3714,29 @@
               <w:rPr>
                 <w:rFonts w:ascii="Calibri" w:eastAsia="Calibri" w:hAnsi="Calibri" w:cs="Calibri"/>
               </w:rPr>
-              <w:t>{{item</w:t>
+              <w:t>{{</w:t>
+            </w:r>
+            <w:proofErr w:type="spellStart"/>
+            <w:proofErr w:type="gramStart"/>
+            <w:r>
+              <w:rPr>
+                <w:rFonts w:ascii="Calibri" w:eastAsia="Calibri" w:hAnsi="Calibri" w:cs="Calibri"/>
+              </w:rPr>
+              <w:t>item</w:t>
             </w:r>
             <w:r>
               <w:rPr>
                 <w:rFonts w:ascii="Calibri" w:eastAsia="Calibri" w:hAnsi="Calibri" w:cs="Calibri"/>
               </w:rPr>
-              <w:t>.nome}}</w:t>
+              <w:t>.nome</w:t>
+            </w:r>
+            <w:proofErr w:type="spellEnd"/>
+            <w:proofErr w:type="gramEnd"/>
+            <w:r>
+              <w:rPr>
+                <w:rFonts w:ascii="Calibri" w:eastAsia="Calibri" w:hAnsi="Calibri" w:cs="Calibri"/>
+              </w:rPr>
+              <w:t>}}</w:t>
             </w:r>
           </w:p>
         </w:tc>
@@ -2895,8 +3755,18 @@
               <w:rPr>
                 <w:rFonts w:ascii="Calibri" w:eastAsia="Calibri" w:hAnsi="Calibri" w:cs="Calibri"/>
               </w:rPr>
-              <w:t>{{item.efeitos</w:t>
+              <w:t>{{</w:t>
             </w:r>
+            <w:proofErr w:type="spellStart"/>
+            <w:proofErr w:type="gramStart"/>
+            <w:r>
+              <w:rPr>
+                <w:rFonts w:ascii="Calibri" w:eastAsia="Calibri" w:hAnsi="Calibri" w:cs="Calibri"/>
+              </w:rPr>
+              <w:t>item.efeitos</w:t>
+            </w:r>
+            <w:proofErr w:type="spellEnd"/>
+            <w:proofErr w:type="gramEnd"/>
             <w:r>
               <w:rPr>
                 <w:rFonts w:ascii="Calibri" w:eastAsia="Calibri" w:hAnsi="Calibri" w:cs="Calibri"/>
@@ -2921,7 +3791,23 @@
               <w:rPr>
                 <w:rFonts w:ascii="Calibri" w:eastAsia="Calibri" w:hAnsi="Calibri" w:cs="Calibri"/>
               </w:rPr>
-              <w:t>{{item.D}}</w:t>
+              <w:t>{{</w:t>
+            </w:r>
+            <w:proofErr w:type="spellStart"/>
+            <w:proofErr w:type="gramStart"/>
+            <w:r>
+              <w:rPr>
+                <w:rFonts w:ascii="Calibri" w:eastAsia="Calibri" w:hAnsi="Calibri" w:cs="Calibri"/>
+              </w:rPr>
+              <w:t>item.D</w:t>
+            </w:r>
+            <w:proofErr w:type="spellEnd"/>
+            <w:proofErr w:type="gramEnd"/>
+            <w:r>
+              <w:rPr>
+                <w:rFonts w:ascii="Calibri" w:eastAsia="Calibri" w:hAnsi="Calibri" w:cs="Calibri"/>
+              </w:rPr>
+              <w:t>}}</w:t>
             </w:r>
           </w:p>
         </w:tc>
@@ -2943,7 +3829,21 @@
               <w:rPr>
                 <w:rFonts w:ascii="Calibri" w:eastAsia="Calibri" w:hAnsi="Calibri" w:cs="Calibri"/>
               </w:rPr>
-              <w:t>{%tr endfor %}</w:t>
+              <w:t xml:space="preserve">{%tr </w:t>
+            </w:r>
+            <w:proofErr w:type="spellStart"/>
+            <w:r>
+              <w:rPr>
+                <w:rFonts w:ascii="Calibri" w:eastAsia="Calibri" w:hAnsi="Calibri" w:cs="Calibri"/>
+              </w:rPr>
+              <w:t>endfor</w:t>
+            </w:r>
+            <w:proofErr w:type="spellEnd"/>
+            <w:r>
+              <w:rPr>
+                <w:rFonts w:ascii="Calibri" w:eastAsia="Calibri" w:hAnsi="Calibri" w:cs="Calibri"/>
+              </w:rPr>
+              <w:t xml:space="preserve"> %}</w:t>
             </w:r>
           </w:p>
         </w:tc>
@@ -3073,7 +3973,35 @@
               <w:rPr>
                 <w:rFonts w:ascii="Calibri" w:eastAsia="Calibri" w:hAnsi="Calibri" w:cs="Calibri"/>
               </w:rPr>
-              <w:t>{%tr for k, v in table_food.items()%}</w:t>
+              <w:t xml:space="preserve">{%tr for k, v in </w:t>
+            </w:r>
+            <w:proofErr w:type="spellStart"/>
+            <w:r>
+              <w:rPr>
+                <w:rFonts w:ascii="Calibri" w:eastAsia="Calibri" w:hAnsi="Calibri" w:cs="Calibri"/>
+              </w:rPr>
+              <w:t>table_</w:t>
+            </w:r>
+            <w:proofErr w:type="gramStart"/>
+            <w:r>
+              <w:rPr>
+                <w:rFonts w:ascii="Calibri" w:eastAsia="Calibri" w:hAnsi="Calibri" w:cs="Calibri"/>
+              </w:rPr>
+              <w:t>food.items</w:t>
+            </w:r>
+            <w:proofErr w:type="spellEnd"/>
+            <w:r>
+              <w:rPr>
+                <w:rFonts w:ascii="Calibri" w:eastAsia="Calibri" w:hAnsi="Calibri" w:cs="Calibri"/>
+              </w:rPr>
+              <w:t>()%</w:t>
+            </w:r>
+            <w:proofErr w:type="gramEnd"/>
+            <w:r>
+              <w:rPr>
+                <w:rFonts w:ascii="Calibri" w:eastAsia="Calibri" w:hAnsi="Calibri" w:cs="Calibri"/>
+              </w:rPr>
+              <w:t>}</w:t>
             </w:r>
           </w:p>
         </w:tc>
@@ -3175,7 +4103,14 @@
               <w:rPr>
                 <w:rFonts w:ascii="Calibri" w:eastAsia="Calibri" w:hAnsi="Calibri" w:cs="Calibri"/>
               </w:rPr>
-              <w:t xml:space="preserve"> end</w:t>
+              <w:t xml:space="preserve"> </w:t>
+            </w:r>
+            <w:proofErr w:type="spellStart"/>
+            <w:r>
+              <w:rPr>
+                <w:rFonts w:ascii="Calibri" w:eastAsia="Calibri" w:hAnsi="Calibri" w:cs="Calibri"/>
+              </w:rPr>
+              <w:t>end</w:t>
             </w:r>
             <w:r>
               <w:rPr>
@@ -3187,7 +4122,14 @@
               <w:rPr>
                 <w:rFonts w:ascii="Calibri" w:eastAsia="Calibri" w:hAnsi="Calibri" w:cs="Calibri"/>
               </w:rPr>
-              <w:t>or %}</w:t>
+              <w:t>or</w:t>
+            </w:r>
+            <w:proofErr w:type="spellEnd"/>
+            <w:r>
+              <w:rPr>
+                <w:rFonts w:ascii="Calibri" w:eastAsia="Calibri" w:hAnsi="Calibri" w:cs="Calibri"/>
+              </w:rPr>
+              <w:t xml:space="preserve"> %}</w:t>
             </w:r>
           </w:p>
         </w:tc>
@@ -3197,7 +4139,6 @@
       <w:pPr>
         <w:widowControl w:val="0"/>
         <w:spacing w:after="0"/>
-        <w:jc w:val="center"/>
         <w:rPr>
           <w:rFonts w:ascii="Calibri" w:eastAsia="Calibri" w:hAnsi="Calibri" w:cs="Calibri"/>
           <w:sz w:val="12"/>
@@ -3210,6 +4151,60 @@
           <w:pgNumType w:start="1"/>
           <w:cols w:space="720"/>
         </w:sectPr>
+      </w:pPr>
+    </w:p>
+    <w:p>
+      <w:pPr>
+        <w:widowControl w:val="0"/>
+        <w:pBdr>
+          <w:top w:val="nil"/>
+          <w:left w:val="nil"/>
+          <w:bottom w:val="nil"/>
+          <w:right w:val="nil"/>
+          <w:between w:val="nil"/>
+        </w:pBdr>
+        <w:spacing w:after="0"/>
+        <w:rPr>
+          <w:rFonts w:ascii="Calibri" w:eastAsia="Calibri" w:hAnsi="Calibri" w:cs="Calibri"/>
+          <w:sz w:val="4"/>
+          <w:szCs w:val="4"/>
+        </w:rPr>
+      </w:pPr>
+    </w:p>
+    <w:p>
+      <w:pPr>
+        <w:widowControl w:val="0"/>
+        <w:pBdr>
+          <w:top w:val="nil"/>
+          <w:left w:val="nil"/>
+          <w:bottom w:val="nil"/>
+          <w:right w:val="nil"/>
+          <w:between w:val="nil"/>
+        </w:pBdr>
+        <w:spacing w:after="0"/>
+        <w:rPr>
+          <w:rFonts w:ascii="Calibri" w:eastAsia="Calibri" w:hAnsi="Calibri" w:cs="Calibri"/>
+          <w:sz w:val="4"/>
+          <w:szCs w:val="4"/>
+        </w:rPr>
+      </w:pPr>
+    </w:p>
+    <w:p>
+      <w:pPr>
+        <w:widowControl w:val="0"/>
+        <w:pBdr>
+          <w:top w:val="nil"/>
+          <w:left w:val="nil"/>
+          <w:bottom w:val="nil"/>
+          <w:right w:val="nil"/>
+          <w:between w:val="nil"/>
+        </w:pBdr>
+        <w:spacing w:after="0"/>
+        <w:rPr>
+          <w:rFonts w:ascii="Calibri" w:eastAsia="Calibri" w:hAnsi="Calibri" w:cs="Calibri"/>
+          <w:sz w:val="4"/>
+          <w:szCs w:val="4"/>
+        </w:rPr>
       </w:pPr>
     </w:p>
     <w:p>
@@ -3300,7 +4295,21 @@
                 <w:rFonts w:ascii="Calibri" w:eastAsia="Calibri" w:hAnsi="Calibri" w:cs="Calibri"/>
                 <w:lang w:val="pt-BR"/>
               </w:rPr>
-              <w:t>Açúcar, adoçantes, leite de vaca, creme de leite, queijo do tipo frescal, alimentos ultraprocessados, salgadinhos, embutidos, frituras, corantes artificiais, espinafre, óleos vegetais (com exceção de azeite de oliva e óleo de coco), farinhas refinadas, sal refinado (trocar por sal marinho).</w:t>
+              <w:t>Açúcar, adoçantes, leite de vaca, creme de leite, queijo do tipo frescal, alimentos ultraprocessados, salgadinhos, embutidos, frituras, corantes artificiais, espinafre,</w:t>
+            </w:r>
+            <w:r>
+              <w:rPr>
+                <w:rFonts w:ascii="Calibri" w:eastAsia="Calibri" w:hAnsi="Calibri" w:cs="Calibri"/>
+                <w:lang w:val="pt-BR"/>
+              </w:rPr>
+              <w:t xml:space="preserve"> bebidas destiladas,</w:t>
+            </w:r>
+            <w:r>
+              <w:rPr>
+                <w:rFonts w:ascii="Calibri" w:eastAsia="Calibri" w:hAnsi="Calibri" w:cs="Calibri"/>
+                <w:lang w:val="pt-BR"/>
+              </w:rPr>
+              <w:t xml:space="preserve"> óleos vegetais (com exceção de azeite de oliva e óleo de coco), farinhas refinadas, sal refinado (trocar por sal marinho).</w:t>
             </w:r>
           </w:p>
         </w:tc>
@@ -3491,7 +4500,21 @@
               <w:rPr>
                 <w:rFonts w:ascii="Calibri" w:eastAsia="Calibri" w:hAnsi="Calibri" w:cs="Calibri"/>
               </w:rPr>
-              <w:t>{%tr for item in table_crystals%}</w:t>
+              <w:t xml:space="preserve">{%tr for item in </w:t>
+            </w:r>
+            <w:proofErr w:type="spellStart"/>
+            <w:r>
+              <w:rPr>
+                <w:rFonts w:ascii="Calibri" w:eastAsia="Calibri" w:hAnsi="Calibri" w:cs="Calibri"/>
+              </w:rPr>
+              <w:t>table_crystals</w:t>
+            </w:r>
+            <w:proofErr w:type="spellEnd"/>
+            <w:r>
+              <w:rPr>
+                <w:rFonts w:ascii="Calibri" w:eastAsia="Calibri" w:hAnsi="Calibri" w:cs="Calibri"/>
+              </w:rPr>
+              <w:t>%}</w:t>
             </w:r>
           </w:p>
         </w:tc>
@@ -3517,7 +4540,23 @@
               <w:rPr>
                 <w:rFonts w:ascii="Calibri" w:eastAsia="Calibri" w:hAnsi="Calibri" w:cs="Calibri"/>
               </w:rPr>
-              <w:t>{{item.cristal}}</w:t>
+              <w:t>{{</w:t>
+            </w:r>
+            <w:proofErr w:type="spellStart"/>
+            <w:proofErr w:type="gramStart"/>
+            <w:r>
+              <w:rPr>
+                <w:rFonts w:ascii="Calibri" w:eastAsia="Calibri" w:hAnsi="Calibri" w:cs="Calibri"/>
+              </w:rPr>
+              <w:t>item.cristal</w:t>
+            </w:r>
+            <w:proofErr w:type="spellEnd"/>
+            <w:proofErr w:type="gramEnd"/>
+            <w:r>
+              <w:rPr>
+                <w:rFonts w:ascii="Calibri" w:eastAsia="Calibri" w:hAnsi="Calibri" w:cs="Calibri"/>
+              </w:rPr>
+              <w:t>}}</w:t>
             </w:r>
           </w:p>
         </w:tc>
@@ -3543,7 +4582,32 @@
                 <w:rFonts w:ascii="Calibri" w:eastAsia="Calibri" w:hAnsi="Calibri" w:cs="Calibri"/>
                 <w:lang w:val="pt-BR"/>
               </w:rPr>
-              <w:t>{{item.beneficios_fisicos}}</w:t>
+              <w:t>{{</w:t>
+            </w:r>
+            <w:proofErr w:type="spellStart"/>
+            <w:proofErr w:type="gramStart"/>
+            <w:r>
+              <w:rPr>
+                <w:rFonts w:ascii="Calibri" w:eastAsia="Calibri" w:hAnsi="Calibri" w:cs="Calibri"/>
+                <w:lang w:val="pt-BR"/>
+              </w:rPr>
+              <w:t>item.beneficios</w:t>
+            </w:r>
+            <w:proofErr w:type="gramEnd"/>
+            <w:r>
+              <w:rPr>
+                <w:rFonts w:ascii="Calibri" w:eastAsia="Calibri" w:hAnsi="Calibri" w:cs="Calibri"/>
+                <w:lang w:val="pt-BR"/>
+              </w:rPr>
+              <w:t>_fisicos</w:t>
+            </w:r>
+            <w:proofErr w:type="spellEnd"/>
+            <w:r>
+              <w:rPr>
+                <w:rFonts w:ascii="Calibri" w:eastAsia="Calibri" w:hAnsi="Calibri" w:cs="Calibri"/>
+                <w:lang w:val="pt-BR"/>
+              </w:rPr>
+              <w:t>}}</w:t>
             </w:r>
           </w:p>
         </w:tc>
@@ -3569,7 +4633,32 @@
                 <w:rFonts w:ascii="Calibri" w:eastAsia="Calibri" w:hAnsi="Calibri" w:cs="Calibri"/>
                 <w:lang w:val="pt-BR"/>
               </w:rPr>
-              <w:t>{{item.beneficios_emocionais}}</w:t>
+              <w:t>{{</w:t>
+            </w:r>
+            <w:proofErr w:type="spellStart"/>
+            <w:proofErr w:type="gramStart"/>
+            <w:r>
+              <w:rPr>
+                <w:rFonts w:ascii="Calibri" w:eastAsia="Calibri" w:hAnsi="Calibri" w:cs="Calibri"/>
+                <w:lang w:val="pt-BR"/>
+              </w:rPr>
+              <w:t>item.beneficios</w:t>
+            </w:r>
+            <w:proofErr w:type="gramEnd"/>
+            <w:r>
+              <w:rPr>
+                <w:rFonts w:ascii="Calibri" w:eastAsia="Calibri" w:hAnsi="Calibri" w:cs="Calibri"/>
+                <w:lang w:val="pt-BR"/>
+              </w:rPr>
+              <w:t>_emocionais</w:t>
+            </w:r>
+            <w:proofErr w:type="spellEnd"/>
+            <w:r>
+              <w:rPr>
+                <w:rFonts w:ascii="Calibri" w:eastAsia="Calibri" w:hAnsi="Calibri" w:cs="Calibri"/>
+                <w:lang w:val="pt-BR"/>
+              </w:rPr>
+              <w:t>}}</w:t>
             </w:r>
           </w:p>
         </w:tc>
@@ -3594,7 +4683,23 @@
               <w:rPr>
                 <w:rFonts w:ascii="Calibri" w:eastAsia="Calibri" w:hAnsi="Calibri" w:cs="Calibri"/>
               </w:rPr>
-              <w:t>{{item.D}}</w:t>
+              <w:t>{{</w:t>
+            </w:r>
+            <w:proofErr w:type="spellStart"/>
+            <w:proofErr w:type="gramStart"/>
+            <w:r>
+              <w:rPr>
+                <w:rFonts w:ascii="Calibri" w:eastAsia="Calibri" w:hAnsi="Calibri" w:cs="Calibri"/>
+              </w:rPr>
+              <w:t>item.D</w:t>
+            </w:r>
+            <w:proofErr w:type="spellEnd"/>
+            <w:proofErr w:type="gramEnd"/>
+            <w:r>
+              <w:rPr>
+                <w:rFonts w:ascii="Calibri" w:eastAsia="Calibri" w:hAnsi="Calibri" w:cs="Calibri"/>
+              </w:rPr>
+              <w:t>}}</w:t>
             </w:r>
           </w:p>
         </w:tc>
@@ -3621,7 +4726,21 @@
               <w:rPr>
                 <w:rFonts w:ascii="Calibri" w:eastAsia="Calibri" w:hAnsi="Calibri" w:cs="Calibri"/>
               </w:rPr>
-              <w:t>{%tr endfor%}</w:t>
+              <w:t xml:space="preserve">{%tr </w:t>
+            </w:r>
+            <w:proofErr w:type="spellStart"/>
+            <w:r>
+              <w:rPr>
+                <w:rFonts w:ascii="Calibri" w:eastAsia="Calibri" w:hAnsi="Calibri" w:cs="Calibri"/>
+              </w:rPr>
+              <w:t>endfor</w:t>
+            </w:r>
+            <w:proofErr w:type="spellEnd"/>
+            <w:r>
+              <w:rPr>
+                <w:rFonts w:ascii="Calibri" w:eastAsia="Calibri" w:hAnsi="Calibri" w:cs="Calibri"/>
+              </w:rPr>
+              <w:t>%}</w:t>
             </w:r>
           </w:p>
         </w:tc>
@@ -3681,7 +4800,16 @@
           <w:bCs/>
           <w:lang w:val="pt-BR"/>
         </w:rPr>
-        <w:t>: 25/11/2025</w:t>
+        <w:t xml:space="preserve">: </w:t>
+      </w:r>
+      <w:r>
+        <w:rPr>
+          <w:rFonts w:ascii="Calibri" w:eastAsia="Calibri" w:hAnsi="Calibri" w:cs="Calibri"/>
+          <w:b/>
+          <w:bCs/>
+          <w:lang w:val="pt-BR"/>
+        </w:rPr>
+        <w:t>{{date}}</w:t>
       </w:r>
       <w:r>
         <w:rPr>
@@ -3697,6 +4825,7 @@
         </w:rPr>
         <w:br/>
       </w:r>
+      <w:proofErr w:type="spellStart"/>
       <w:r>
         <w:rPr>
           <w:rFonts w:ascii="Calibri" w:eastAsia="Calibri" w:hAnsi="Calibri" w:cs="Calibri"/>
@@ -3704,7 +4833,17 @@
           <w:bCs/>
           <w:lang w:val="pt-BR"/>
         </w:rPr>
-        <w:t>Bienestar - Terapias Biofísicas</w:t>
+        <w:t>Bienestar</w:t>
+      </w:r>
+      <w:proofErr w:type="spellEnd"/>
+      <w:r>
+        <w:rPr>
+          <w:rFonts w:ascii="Calibri" w:eastAsia="Calibri" w:hAnsi="Calibri" w:cs="Calibri"/>
+          <w:b/>
+          <w:bCs/>
+          <w:lang w:val="pt-BR"/>
+        </w:rPr>
+        <w:t xml:space="preserve"> - Terapias Biofísicas</w:t>
       </w:r>
       <w:r>
         <w:rPr>
@@ -3728,7 +4867,23 @@
           <w:lang w:val="pt-BR"/>
         </w:rPr>
         <w:br/>
-        <w:t>Email: bienestarsantos@gmail.com | Instagram: @bienestarsantos  -    WhatsApp: (13) 99147-4404</w:t>
+        <w:t>Email: bienestarsantos@gmail.com | Instagram: @</w:t>
+      </w:r>
+      <w:proofErr w:type="gramStart"/>
+      <w:r>
+        <w:rPr>
+          <w:rFonts w:ascii="Calibri" w:eastAsia="Calibri" w:hAnsi="Calibri" w:cs="Calibri"/>
+          <w:lang w:val="pt-BR"/>
+        </w:rPr>
+        <w:t>bienestarsantos  -</w:t>
+      </w:r>
+      <w:proofErr w:type="gramEnd"/>
+      <w:r>
+        <w:rPr>
+          <w:rFonts w:ascii="Calibri" w:eastAsia="Calibri" w:hAnsi="Calibri" w:cs="Calibri"/>
+          <w:lang w:val="pt-BR"/>
+        </w:rPr>
+        <w:t xml:space="preserve">    WhatsApp: (13) 99147-4404</w:t>
       </w:r>
     </w:p>
     <w:sectPr>
@@ -4035,6 +5190,244 @@
     </w:lvl>
   </w:abstractNum>
   <w:abstractNum w:abstractNumId="1" w15:restartNumberingAfterBreak="0">
+    <w:nsid w:val="277164F2"/>
+    <w:multiLevelType w:val="hybridMultilevel"/>
+    <w:tmpl w:val="F1DC35C6"/>
+    <w:lvl w:ilvl="0" w:tplc="0416000F">
+      <w:start w:val="1"/>
+      <w:numFmt w:val="decimal"/>
+      <w:lvlText w:val="%1."/>
+      <w:lvlJc w:val="left"/>
+      <w:pPr>
+        <w:ind w:left="360" w:hanging="360"/>
+      </w:pPr>
+      <w:rPr>
+        <w:rFonts w:hint="default"/>
+      </w:rPr>
+    </w:lvl>
+    <w:lvl w:ilvl="1" w:tplc="04160019" w:tentative="1">
+      <w:start w:val="1"/>
+      <w:numFmt w:val="lowerLetter"/>
+      <w:lvlText w:val="%2."/>
+      <w:lvlJc w:val="left"/>
+      <w:pPr>
+        <w:ind w:left="1080" w:hanging="360"/>
+      </w:pPr>
+    </w:lvl>
+    <w:lvl w:ilvl="2" w:tplc="0416001B" w:tentative="1">
+      <w:start w:val="1"/>
+      <w:numFmt w:val="lowerRoman"/>
+      <w:lvlText w:val="%3."/>
+      <w:lvlJc w:val="right"/>
+      <w:pPr>
+        <w:ind w:left="1800" w:hanging="180"/>
+      </w:pPr>
+    </w:lvl>
+    <w:lvl w:ilvl="3" w:tplc="0416000F" w:tentative="1">
+      <w:start w:val="1"/>
+      <w:numFmt w:val="decimal"/>
+      <w:lvlText w:val="%4."/>
+      <w:lvlJc w:val="left"/>
+      <w:pPr>
+        <w:ind w:left="2520" w:hanging="360"/>
+      </w:pPr>
+    </w:lvl>
+    <w:lvl w:ilvl="4" w:tplc="04160019" w:tentative="1">
+      <w:start w:val="1"/>
+      <w:numFmt w:val="lowerLetter"/>
+      <w:lvlText w:val="%5."/>
+      <w:lvlJc w:val="left"/>
+      <w:pPr>
+        <w:ind w:left="3240" w:hanging="360"/>
+      </w:pPr>
+    </w:lvl>
+    <w:lvl w:ilvl="5" w:tplc="0416001B" w:tentative="1">
+      <w:start w:val="1"/>
+      <w:numFmt w:val="lowerRoman"/>
+      <w:lvlText w:val="%6."/>
+      <w:lvlJc w:val="right"/>
+      <w:pPr>
+        <w:ind w:left="3960" w:hanging="180"/>
+      </w:pPr>
+    </w:lvl>
+    <w:lvl w:ilvl="6" w:tplc="0416000F" w:tentative="1">
+      <w:start w:val="1"/>
+      <w:numFmt w:val="decimal"/>
+      <w:lvlText w:val="%7."/>
+      <w:lvlJc w:val="left"/>
+      <w:pPr>
+        <w:ind w:left="4680" w:hanging="360"/>
+      </w:pPr>
+    </w:lvl>
+    <w:lvl w:ilvl="7" w:tplc="04160019" w:tentative="1">
+      <w:start w:val="1"/>
+      <w:numFmt w:val="lowerLetter"/>
+      <w:lvlText w:val="%8."/>
+      <w:lvlJc w:val="left"/>
+      <w:pPr>
+        <w:ind w:left="5400" w:hanging="360"/>
+      </w:pPr>
+    </w:lvl>
+    <w:lvl w:ilvl="8" w:tplc="0416001B" w:tentative="1">
+      <w:start w:val="1"/>
+      <w:numFmt w:val="lowerRoman"/>
+      <w:lvlText w:val="%9."/>
+      <w:lvlJc w:val="right"/>
+      <w:pPr>
+        <w:ind w:left="6120" w:hanging="180"/>
+      </w:pPr>
+    </w:lvl>
+  </w:abstractNum>
+  <w:abstractNum w:abstractNumId="2" w15:restartNumberingAfterBreak="0">
+    <w:nsid w:val="44C46135"/>
+    <w:multiLevelType w:val="multilevel"/>
+    <w:tmpl w:val="E48A190A"/>
+    <w:lvl w:ilvl="0">
+      <w:start w:val="1"/>
+      <w:numFmt w:val="bullet"/>
+      <w:lvlText w:val=""/>
+      <w:lvlJc w:val="left"/>
+      <w:pPr>
+        <w:tabs>
+          <w:tab w:val="num" w:pos="720"/>
+        </w:tabs>
+        <w:ind w:left="720" w:hanging="360"/>
+      </w:pPr>
+      <w:rPr>
+        <w:rFonts w:ascii="Symbol" w:hAnsi="Symbol" w:hint="default"/>
+        <w:sz w:val="20"/>
+      </w:rPr>
+    </w:lvl>
+    <w:lvl w:ilvl="1" w:tentative="1">
+      <w:start w:val="1"/>
+      <w:numFmt w:val="bullet"/>
+      <w:lvlText w:val="o"/>
+      <w:lvlJc w:val="left"/>
+      <w:pPr>
+        <w:tabs>
+          <w:tab w:val="num" w:pos="1440"/>
+        </w:tabs>
+        <w:ind w:left="1440" w:hanging="360"/>
+      </w:pPr>
+      <w:rPr>
+        <w:rFonts w:ascii="Courier New" w:hAnsi="Courier New" w:hint="default"/>
+        <w:sz w:val="20"/>
+      </w:rPr>
+    </w:lvl>
+    <w:lvl w:ilvl="2" w:tentative="1">
+      <w:start w:val="1"/>
+      <w:numFmt w:val="bullet"/>
+      <w:lvlText w:val=""/>
+      <w:lvlJc w:val="left"/>
+      <w:pPr>
+        <w:tabs>
+          <w:tab w:val="num" w:pos="2160"/>
+        </w:tabs>
+        <w:ind w:left="2160" w:hanging="360"/>
+      </w:pPr>
+      <w:rPr>
+        <w:rFonts w:ascii="Wingdings" w:hAnsi="Wingdings" w:hint="default"/>
+        <w:sz w:val="20"/>
+      </w:rPr>
+    </w:lvl>
+    <w:lvl w:ilvl="3" w:tentative="1">
+      <w:start w:val="1"/>
+      <w:numFmt w:val="bullet"/>
+      <w:lvlText w:val=""/>
+      <w:lvlJc w:val="left"/>
+      <w:pPr>
+        <w:tabs>
+          <w:tab w:val="num" w:pos="2880"/>
+        </w:tabs>
+        <w:ind w:left="2880" w:hanging="360"/>
+      </w:pPr>
+      <w:rPr>
+        <w:rFonts w:ascii="Wingdings" w:hAnsi="Wingdings" w:hint="default"/>
+        <w:sz w:val="20"/>
+      </w:rPr>
+    </w:lvl>
+    <w:lvl w:ilvl="4" w:tentative="1">
+      <w:start w:val="1"/>
+      <w:numFmt w:val="bullet"/>
+      <w:lvlText w:val=""/>
+      <w:lvlJc w:val="left"/>
+      <w:pPr>
+        <w:tabs>
+          <w:tab w:val="num" w:pos="3600"/>
+        </w:tabs>
+        <w:ind w:left="3600" w:hanging="360"/>
+      </w:pPr>
+      <w:rPr>
+        <w:rFonts w:ascii="Wingdings" w:hAnsi="Wingdings" w:hint="default"/>
+        <w:sz w:val="20"/>
+      </w:rPr>
+    </w:lvl>
+    <w:lvl w:ilvl="5" w:tentative="1">
+      <w:start w:val="1"/>
+      <w:numFmt w:val="bullet"/>
+      <w:lvlText w:val=""/>
+      <w:lvlJc w:val="left"/>
+      <w:pPr>
+        <w:tabs>
+          <w:tab w:val="num" w:pos="4320"/>
+        </w:tabs>
+        <w:ind w:left="4320" w:hanging="360"/>
+      </w:pPr>
+      <w:rPr>
+        <w:rFonts w:ascii="Wingdings" w:hAnsi="Wingdings" w:hint="default"/>
+        <w:sz w:val="20"/>
+      </w:rPr>
+    </w:lvl>
+    <w:lvl w:ilvl="6" w:tentative="1">
+      <w:start w:val="1"/>
+      <w:numFmt w:val="bullet"/>
+      <w:lvlText w:val=""/>
+      <w:lvlJc w:val="left"/>
+      <w:pPr>
+        <w:tabs>
+          <w:tab w:val="num" w:pos="5040"/>
+        </w:tabs>
+        <w:ind w:left="5040" w:hanging="360"/>
+      </w:pPr>
+      <w:rPr>
+        <w:rFonts w:ascii="Wingdings" w:hAnsi="Wingdings" w:hint="default"/>
+        <w:sz w:val="20"/>
+      </w:rPr>
+    </w:lvl>
+    <w:lvl w:ilvl="7" w:tentative="1">
+      <w:start w:val="1"/>
+      <w:numFmt w:val="bullet"/>
+      <w:lvlText w:val=""/>
+      <w:lvlJc w:val="left"/>
+      <w:pPr>
+        <w:tabs>
+          <w:tab w:val="num" w:pos="5760"/>
+        </w:tabs>
+        <w:ind w:left="5760" w:hanging="360"/>
+      </w:pPr>
+      <w:rPr>
+        <w:rFonts w:ascii="Wingdings" w:hAnsi="Wingdings" w:hint="default"/>
+        <w:sz w:val="20"/>
+      </w:rPr>
+    </w:lvl>
+    <w:lvl w:ilvl="8" w:tentative="1">
+      <w:start w:val="1"/>
+      <w:numFmt w:val="bullet"/>
+      <w:lvlText w:val=""/>
+      <w:lvlJc w:val="left"/>
+      <w:pPr>
+        <w:tabs>
+          <w:tab w:val="num" w:pos="6480"/>
+        </w:tabs>
+        <w:ind w:left="6480" w:hanging="360"/>
+      </w:pPr>
+      <w:rPr>
+        <w:rFonts w:ascii="Wingdings" w:hAnsi="Wingdings" w:hint="default"/>
+        <w:sz w:val="20"/>
+      </w:rPr>
+    </w:lvl>
+  </w:abstractNum>
+  <w:abstractNum w:abstractNumId="3" w15:restartNumberingAfterBreak="0">
     <w:nsid w:val="7EAE3B7E"/>
     <w:multiLevelType w:val="multilevel"/>
     <w:tmpl w:val="24FE91DC"/>
@@ -4125,10 +5518,16 @@
     </w:lvl>
   </w:abstractNum>
   <w:num w:numId="1" w16cid:durableId="783691717">
-    <w:abstractNumId w:val="1"/>
+    <w:abstractNumId w:val="3"/>
   </w:num>
   <w:num w:numId="2" w16cid:durableId="1982074806">
     <w:abstractNumId w:val="0"/>
+  </w:num>
+  <w:num w:numId="3" w16cid:durableId="1331131189">
+    <w:abstractNumId w:val="1"/>
+  </w:num>
+  <w:num w:numId="4" w16cid:durableId="1972395637">
+    <w:abstractNumId w:val="2"/>
   </w:num>
 </w:numbering>
 </file>

</xml_diff>